<commit_message>
Felhasznaloi WPF Doksi kész
</commit_message>
<xml_diff>
--- a/doc/WPF_felhasznaloi.docx
+++ b/doc/WPF_felhasznaloi.docx
@@ -4,21 +4,26 @@
   <w:body>
     <w:p>
       <w:pPr>
-        <w:shd w:val="clear" w:color="auto" w:fill="FFFFFF" w:themeFill="background1"/>
-        <w:jc w:val="center"/>
-        <w:rPr>
-          <w:color w:val="000000" w:themeColor="text1"/>
+        <w:pStyle w:val="Kiemeltidzet"/>
+        <w:rPr>
+          <w:b/>
+          <w:sz w:val="32"/>
+          <w:szCs w:val="32"/>
         </w:rPr>
       </w:pPr>
       <w:r>
         <w:rPr>
-          <w:color w:val="000000" w:themeColor="text1"/>
+          <w:b/>
+          <w:sz w:val="32"/>
+          <w:szCs w:val="32"/>
         </w:rPr>
         <w:t>OpenForum Adminisztrációs Felület</w:t>
       </w:r>
       <w:r>
         <w:rPr>
-          <w:color w:val="000000" w:themeColor="text1"/>
+          <w:b/>
+          <w:sz w:val="32"/>
+          <w:szCs w:val="32"/>
         </w:rPr>
         <w:br/>
         <w:t>Felhasználói Dokumentáció</w:t>
@@ -37,12 +42,18 @@
       <w:pPr>
         <w:shd w:val="clear" w:color="auto" w:fill="FFFFFF" w:themeFill="background1"/>
         <w:rPr>
-          <w:color w:val="000000" w:themeColor="text1"/>
+          <w:rStyle w:val="Erskiemels"/>
+          <w:b/>
+          <w:sz w:val="28"/>
+          <w:szCs w:val="28"/>
         </w:rPr>
       </w:pPr>
       <w:r>
         <w:rPr>
-          <w:color w:val="000000" w:themeColor="text1"/>
+          <w:rStyle w:val="Erskiemels"/>
+          <w:b/>
+          <w:sz w:val="28"/>
+          <w:szCs w:val="28"/>
         </w:rPr>
         <w:t>Rövid összefoglaló:</w:t>
       </w:r>
@@ -56,6 +67,62 @@
       </w:pPr>
       <w:r>
         <w:rPr>
+          <w:color w:val="000000" w:themeColor="text1"/>
+        </w:rPr>
+        <w:t>Az OpenForum asztali adminisztrációs felület, az oldalt kezelő adminisztrátoroknak szól.</w:t>
+      </w:r>
+      <w:r>
+        <w:rPr>
+          <w:color w:val="000000" w:themeColor="text1"/>
+        </w:rPr>
+        <w:br/>
+        <w:t>Lehetővé teszi, az összes adat közti gyors keresést, hatékony felhasználó, illetve közösség</w:t>
+      </w:r>
+      <w:r>
+        <w:rPr>
+          <w:color w:val="000000" w:themeColor="text1"/>
+        </w:rPr>
+        <w:br/>
+        <w:t xml:space="preserve">moderálás érdekében. Az alkalmazáson belül, külön oldal szolgál más-más adatfajták </w:t>
+      </w:r>
+      <w:proofErr w:type="gramStart"/>
+      <w:r>
+        <w:rPr>
+          <w:color w:val="000000" w:themeColor="text1"/>
+        </w:rPr>
+        <w:t>kezelésére</w:t>
+      </w:r>
+      <w:proofErr w:type="gramEnd"/>
+      <w:r>
+        <w:rPr>
+          <w:color w:val="000000" w:themeColor="text1"/>
+        </w:rPr>
+        <w:t xml:space="preserve"> mint például felhasználók, közösségek, posztok, kommentek, bejelentések, és ezeknek módosítása, törlése, tiltása, </w:t>
+      </w:r>
+      <w:proofErr w:type="spellStart"/>
+      <w:r>
+        <w:rPr>
+          <w:color w:val="000000" w:themeColor="text1"/>
+        </w:rPr>
+        <w:t>validálása</w:t>
+      </w:r>
+      <w:proofErr w:type="spellEnd"/>
+      <w:r>
+        <w:rPr>
+          <w:color w:val="000000" w:themeColor="text1"/>
+        </w:rPr>
+        <w:t>.</w:t>
+      </w:r>
+    </w:p>
+    <w:p>
+      <w:pPr>
+        <w:shd w:val="clear" w:color="auto" w:fill="FFFFFF" w:themeFill="background1"/>
+        <w:rPr>
+          <w:color w:val="000000" w:themeColor="text1"/>
+        </w:rPr>
+      </w:pPr>
+      <w:r>
+        <w:rPr>
           <w:noProof/>
           <w:color w:val="000000" w:themeColor="text1"/>
         </w:rPr>
@@ -63,19 +130,19 @@
           <wp:anchor distT="0" distB="0" distL="114300" distR="114300" simplePos="0" relativeHeight="251658240" behindDoc="1" locked="0" layoutInCell="1" allowOverlap="1">
             <wp:simplePos x="0" y="0"/>
             <wp:positionH relativeFrom="margin">
-              <wp:posOffset>485775</wp:posOffset>
+              <wp:align>center</wp:align>
             </wp:positionH>
             <wp:positionV relativeFrom="paragraph">
-              <wp:posOffset>1069340</wp:posOffset>
+              <wp:posOffset>9525</wp:posOffset>
             </wp:positionV>
-            <wp:extent cx="4789170" cy="2672715"/>
-            <wp:effectExtent l="0" t="0" r="0" b="0"/>
+            <wp:extent cx="3741420" cy="2087880"/>
+            <wp:effectExtent l="0" t="0" r="0" b="7620"/>
             <wp:wrapTight wrapText="bothSides">
               <wp:wrapPolygon edited="0">
                 <wp:start x="0" y="0"/>
-                <wp:lineTo x="0" y="21400"/>
-                <wp:lineTo x="21480" y="21400"/>
-                <wp:lineTo x="21480" y="0"/>
+                <wp:lineTo x="0" y="21482"/>
+                <wp:lineTo x="21446" y="21482"/>
+                <wp:lineTo x="21446" y="0"/>
                 <wp:lineTo x="0" y="0"/>
               </wp:wrapPolygon>
             </wp:wrapTight>
@@ -105,7 +172,7 @@
                   <pic:spPr>
                     <a:xfrm>
                       <a:off x="0" y="0"/>
-                      <a:ext cx="4789170" cy="2672715"/>
+                      <a:ext cx="3741420" cy="2087880"/>
                     </a:xfrm>
                     <a:prstGeom prst="rect">
                       <a:avLst/>
@@ -123,54 +190,6 @@
           </wp:anchor>
         </w:drawing>
       </w:r>
-      <w:r>
-        <w:rPr>
-          <w:color w:val="000000" w:themeColor="text1"/>
-        </w:rPr>
-        <w:t>Az OpenForum asztali adminisztrációs felület, az oldalt kezelő adminisztrátoroknak szól.</w:t>
-      </w:r>
-      <w:r>
-        <w:rPr>
-          <w:color w:val="000000" w:themeColor="text1"/>
-        </w:rPr>
-        <w:br/>
-        <w:t>Lehetővé teszi, az összes adat közti gyors keresést, hatékony felhasználó, illetve közösség</w:t>
-      </w:r>
-      <w:r>
-        <w:rPr>
-          <w:color w:val="000000" w:themeColor="text1"/>
-        </w:rPr>
-        <w:br/>
-        <w:t xml:space="preserve">moderálás érdekében. Az alkalmazáson belül, külön oldal szolgál más-más adatfajták </w:t>
-      </w:r>
-      <w:proofErr w:type="gramStart"/>
-      <w:r>
-        <w:rPr>
-          <w:color w:val="000000" w:themeColor="text1"/>
-        </w:rPr>
-        <w:t>kezelésére</w:t>
-      </w:r>
-      <w:proofErr w:type="gramEnd"/>
-      <w:r>
-        <w:rPr>
-          <w:color w:val="000000" w:themeColor="text1"/>
-        </w:rPr>
-        <w:t xml:space="preserve"> mint például felhasználók, közösségek, posztok, kommentek, bejelentések, és ezeknek módosítása, törlése, tiltása, </w:t>
-      </w:r>
-      <w:proofErr w:type="spellStart"/>
-      <w:r>
-        <w:rPr>
-          <w:color w:val="000000" w:themeColor="text1"/>
-        </w:rPr>
-        <w:t>validálása</w:t>
-      </w:r>
-      <w:proofErr w:type="spellEnd"/>
-      <w:r>
-        <w:rPr>
-          <w:color w:val="000000" w:themeColor="text1"/>
-        </w:rPr>
-        <w:t>.</w:t>
-      </w:r>
     </w:p>
     <w:p>
       <w:pPr>
@@ -232,9 +251,21 @@
       <w:pPr>
         <w:shd w:val="clear" w:color="auto" w:fill="FFFFFF" w:themeFill="background1"/>
         <w:rPr>
-          <w:color w:val="000000" w:themeColor="text1"/>
+          <w:rStyle w:val="Erskiemels"/>
+          <w:b/>
+          <w:sz w:val="28"/>
+          <w:szCs w:val="28"/>
         </w:rPr>
       </w:pPr>
+      <w:r>
+        <w:rPr>
+          <w:rStyle w:val="Erskiemels"/>
+          <w:b/>
+          <w:sz w:val="28"/>
+          <w:szCs w:val="28"/>
+        </w:rPr>
+        <w:t>Átfogó Bemutatás:</w:t>
+      </w:r>
     </w:p>
     <w:p>
       <w:pPr>
@@ -243,6 +274,257 @@
           <w:color w:val="000000" w:themeColor="text1"/>
         </w:rPr>
       </w:pPr>
+      <w:r>
+        <w:rPr>
+          <w:rStyle w:val="Cmsor2Char"/>
+          <w:b/>
+        </w:rPr>
+        <w:t>Kezdő Oldal:</w:t>
+      </w:r>
+      <w:r>
+        <w:rPr>
+          <w:color w:val="000000" w:themeColor="text1"/>
+        </w:rPr>
+        <w:br/>
+      </w:r>
+      <w:r>
+        <w:rPr>
+          <w:color w:val="000000" w:themeColor="text1"/>
+        </w:rPr>
+        <w:t>Ez tölt</w:t>
+      </w:r>
+      <w:r>
+        <w:rPr>
+          <w:color w:val="000000" w:themeColor="text1"/>
+        </w:rPr>
+        <w:t xml:space="preserve"> be az alkalmazás indításkor, ez az oldal szolgál navigációs pontként.</w:t>
+      </w:r>
+      <w:r>
+        <w:rPr>
+          <w:color w:val="000000" w:themeColor="text1"/>
+        </w:rPr>
+        <w:br/>
+        <w:t>Kinézete a „Rövid Összefoglalás” résznél található képen tekinthető meg.</w:t>
+      </w:r>
+      <w:r>
+        <w:rPr>
+          <w:color w:val="000000" w:themeColor="text1"/>
+        </w:rPr>
+        <w:br/>
+        <w:t>A felületen 6 gomb található.</w:t>
+      </w:r>
+      <w:r>
+        <w:rPr>
+          <w:color w:val="000000" w:themeColor="text1"/>
+        </w:rPr>
+        <w:br/>
+        <w:t>Jobb alul a kilépés gomb, amely kattintáskor bezárja a programot.</w:t>
+      </w:r>
+      <w:r>
+        <w:rPr>
+          <w:color w:val="000000" w:themeColor="text1"/>
+        </w:rPr>
+        <w:br/>
+        <w:t>A másik öt gomb a rajta szereplő felirattal megegyező kezelési oldalt nyitja meg.</w:t>
+      </w:r>
+      <w:r>
+        <w:rPr>
+          <w:color w:val="000000" w:themeColor="text1"/>
+        </w:rPr>
+        <w:br/>
+      </w:r>
+      <w:r>
+        <w:rPr>
+          <w:color w:val="000000" w:themeColor="text1"/>
+        </w:rPr>
+        <w:br/>
+      </w:r>
+      <w:r>
+        <w:rPr>
+          <w:rStyle w:val="Cmsor2Char"/>
+          <w:b/>
+        </w:rPr>
+        <w:t>Felhasználó Kezelési Felület:</w:t>
+      </w:r>
+      <w:r>
+        <w:rPr>
+          <w:color w:val="000000" w:themeColor="text1"/>
+        </w:rPr>
+        <w:br/>
+        <w:t>Ezen a felületen a táblázatban láthatja az összes felhasználó adatait, a jelszó, és profilkép kivételével.</w:t>
+      </w:r>
+      <w:r>
+        <w:rPr>
+          <w:color w:val="000000" w:themeColor="text1"/>
+        </w:rPr>
+        <w:br/>
+        <w:t>A Keresés felirat alatti fehér mezőben, kezdje el írni a keresett felhasználó valamely adatát. Ez a táblázatból kiszűri a beírt adattal rendelkező felhasználót.</w:t>
+      </w:r>
+      <w:r>
+        <w:rPr>
+          <w:color w:val="000000" w:themeColor="text1"/>
+        </w:rPr>
+        <w:br/>
+        <w:t>A táblázatban kattintson egy sorra, ezzel kiválasztva az adott felhasználót.</w:t>
+      </w:r>
+      <w:r>
+        <w:rPr>
+          <w:color w:val="000000" w:themeColor="text1"/>
+        </w:rPr>
+        <w:br/>
+        <w:t>A lenti mezőkben megjelennek az adatok, ezeket szabadon tudja szerkeszteni.</w:t>
+      </w:r>
+      <w:r>
+        <w:rPr>
+          <w:color w:val="000000" w:themeColor="text1"/>
+        </w:rPr>
+        <w:br/>
+        <w:t xml:space="preserve">A </w:t>
+      </w:r>
+      <w:proofErr w:type="spellStart"/>
+      <w:r>
+        <w:rPr>
+          <w:color w:val="000000" w:themeColor="text1"/>
+        </w:rPr>
+        <w:t>role</w:t>
+      </w:r>
+      <w:proofErr w:type="spellEnd"/>
+      <w:r>
+        <w:rPr>
+          <w:color w:val="000000" w:themeColor="text1"/>
+        </w:rPr>
+        <w:t>, azaz a felhasználó szerepe lehet „</w:t>
+      </w:r>
+      <w:proofErr w:type="spellStart"/>
+      <w:r>
+        <w:rPr>
+          <w:color w:val="000000" w:themeColor="text1"/>
+        </w:rPr>
+        <w:t>User</w:t>
+      </w:r>
+      <w:proofErr w:type="spellEnd"/>
+      <w:r>
+        <w:rPr>
+          <w:color w:val="000000" w:themeColor="text1"/>
+        </w:rPr>
+        <w:t>”(U) és „</w:t>
+      </w:r>
+      <w:proofErr w:type="spellStart"/>
+      <w:r>
+        <w:rPr>
+          <w:color w:val="000000" w:themeColor="text1"/>
+        </w:rPr>
+        <w:t>Admin</w:t>
+      </w:r>
+      <w:proofErr w:type="spellEnd"/>
+      <w:r>
+        <w:rPr>
+          <w:color w:val="000000" w:themeColor="text1"/>
+        </w:rPr>
+        <w:t>”(A).</w:t>
+      </w:r>
+      <w:r>
+        <w:rPr>
+          <w:color w:val="000000" w:themeColor="text1"/>
+        </w:rPr>
+        <w:br/>
+        <w:t xml:space="preserve">A </w:t>
+      </w:r>
+      <w:proofErr w:type="spellStart"/>
+      <w:r>
+        <w:rPr>
+          <w:color w:val="000000" w:themeColor="text1"/>
+        </w:rPr>
+        <w:t>blocked</w:t>
+      </w:r>
+      <w:proofErr w:type="spellEnd"/>
+      <w:r>
+        <w:rPr>
+          <w:color w:val="000000" w:themeColor="text1"/>
+        </w:rPr>
+        <w:t>, azaz hogy a felhasználó kivan-e tiltva, lehet 0(Nem), 1(Igen).</w:t>
+      </w:r>
+      <w:r>
+        <w:rPr>
+          <w:color w:val="000000" w:themeColor="text1"/>
+        </w:rPr>
+        <w:br/>
+        <w:t>A Piros kitiltás gombra kattintva, blokkolhatja a felhasználót(</w:t>
+      </w:r>
+      <w:proofErr w:type="spellStart"/>
+      <w:r>
+        <w:rPr>
+          <w:color w:val="000000" w:themeColor="text1"/>
+        </w:rPr>
+        <w:t>Blocked</w:t>
+      </w:r>
+      <w:proofErr w:type="spellEnd"/>
+      <w:r>
+        <w:rPr>
+          <w:color w:val="000000" w:themeColor="text1"/>
+        </w:rPr>
+        <w:t xml:space="preserve"> értéke 1-re változik).</w:t>
+      </w:r>
+      <w:r>
+        <w:rPr>
+          <w:color w:val="000000" w:themeColor="text1"/>
+        </w:rPr>
+        <w:br/>
+        <w:t>Ha a felhasználó már blokkolva van akkor a piros gomb helyén feloldás gomb jelenik meg.</w:t>
+      </w:r>
+      <w:r>
+        <w:rPr>
+          <w:color w:val="000000" w:themeColor="text1"/>
+        </w:rPr>
+        <w:br/>
+        <w:t>Erre kattintva feloldhatja a felhasználó blokkolását(</w:t>
+      </w:r>
+      <w:proofErr w:type="spellStart"/>
+      <w:r>
+        <w:rPr>
+          <w:color w:val="000000" w:themeColor="text1"/>
+        </w:rPr>
+        <w:t>Blocked</w:t>
+      </w:r>
+      <w:proofErr w:type="spellEnd"/>
+      <w:r>
+        <w:rPr>
+          <w:color w:val="000000" w:themeColor="text1"/>
+        </w:rPr>
+        <w:t xml:space="preserve"> értéke 0-ra változik).</w:t>
+      </w:r>
+      <w:r>
+        <w:rPr>
+          <w:color w:val="000000" w:themeColor="text1"/>
+        </w:rPr>
+        <w:br/>
+      </w:r>
+      <w:r>
+        <w:rPr>
+          <w:color w:val="000000" w:themeColor="text1"/>
+        </w:rPr>
+        <w:lastRenderedPageBreak/>
+        <w:t>A módosítás gomb csak akkor kattintható, ha a táblázatból már kiválasztott felhasználót, illetve annak valamely adatát már változtatta, a felirattal jelölt fehér mezőkben.</w:t>
+      </w:r>
+      <w:r>
+        <w:rPr>
+          <w:color w:val="000000" w:themeColor="text1"/>
+        </w:rPr>
+        <w:br/>
+      </w:r>
+      <w:r>
+        <w:rPr>
+          <w:color w:val="000000" w:themeColor="text1"/>
+        </w:rPr>
+        <w:t>Erre a gombra kattintva véglegesítheti a végbe vitt módosításokat.</w:t>
+      </w:r>
+      <w:r>
+        <w:rPr>
+          <w:color w:val="000000" w:themeColor="text1"/>
+        </w:rPr>
+        <w:br/>
+        <w:t>Vissza gombra kattintáskor, bezáródik az oldal, a kezdőoldalra tér vissza.</w:t>
+      </w:r>
     </w:p>
     <w:p>
       <w:pPr>
@@ -251,127 +533,168 @@
           <w:color w:val="000000" w:themeColor="text1"/>
         </w:rPr>
       </w:pPr>
-    </w:p>
-    <w:p>
-      <w:pPr>
-        <w:shd w:val="clear" w:color="auto" w:fill="FFFFFF" w:themeFill="background1"/>
-        <w:rPr>
-          <w:color w:val="000000" w:themeColor="text1"/>
-        </w:rPr>
-      </w:pPr>
-    </w:p>
-    <w:p>
-      <w:pPr>
-        <w:shd w:val="clear" w:color="auto" w:fill="FFFFFF" w:themeFill="background1"/>
-        <w:rPr>
-          <w:color w:val="000000" w:themeColor="text1"/>
-        </w:rPr>
-      </w:pPr>
-      <w:r>
-        <w:rPr>
-          <w:color w:val="000000" w:themeColor="text1"/>
-        </w:rPr>
-        <w:t>Átfogó Bemutatás:</w:t>
-      </w:r>
-    </w:p>
-    <w:p>
-      <w:pPr>
-        <w:shd w:val="clear" w:color="auto" w:fill="FFFFFF" w:themeFill="background1"/>
-        <w:rPr>
-          <w:color w:val="000000" w:themeColor="text1"/>
-        </w:rPr>
-      </w:pPr>
-      <w:r>
-        <w:rPr>
-          <w:color w:val="000000" w:themeColor="text1"/>
-        </w:rPr>
-        <w:t>Kezdő Oldal:</w:t>
-      </w:r>
-      <w:r>
-        <w:rPr>
-          <w:color w:val="000000" w:themeColor="text1"/>
-        </w:rPr>
-        <w:br/>
-      </w:r>
-      <w:r>
-        <w:rPr>
-          <w:color w:val="000000" w:themeColor="text1"/>
-        </w:rPr>
-        <w:t>Ez tölt</w:t>
-      </w:r>
-      <w:r>
-        <w:rPr>
-          <w:color w:val="000000" w:themeColor="text1"/>
-        </w:rPr>
-        <w:t xml:space="preserve"> be az alkalmazás indításkor, ez az oldal szolgál navigációs pontként.</w:t>
-      </w:r>
-      <w:r>
-        <w:rPr>
-          <w:color w:val="000000" w:themeColor="text1"/>
-        </w:rPr>
-        <w:br/>
-        <w:t>Kinézete a „Rövid Összefoglalás” résznél található képen tekinthető meg.</w:t>
-      </w:r>
-      <w:r>
-        <w:rPr>
-          <w:color w:val="000000" w:themeColor="text1"/>
-        </w:rPr>
-        <w:br/>
-        <w:t>A felületen 6 gomb található.</w:t>
-      </w:r>
-      <w:r>
-        <w:rPr>
-          <w:color w:val="000000" w:themeColor="text1"/>
-        </w:rPr>
-        <w:br/>
-        <w:t>Jobb alul a kilépés gomb, amely kattintáskor bezárja a programot.</w:t>
-      </w:r>
-      <w:r>
-        <w:rPr>
-          <w:color w:val="000000" w:themeColor="text1"/>
-        </w:rPr>
-        <w:br/>
-        <w:t>A másik öt gomb a rajta szereplő felirattal megegyező kezelési oldalt nyitja meg.</w:t>
-      </w:r>
-      <w:r>
-        <w:rPr>
-          <w:color w:val="000000" w:themeColor="text1"/>
-        </w:rPr>
-        <w:br/>
-      </w:r>
-      <w:r>
-        <w:rPr>
-          <w:color w:val="000000" w:themeColor="text1"/>
-        </w:rPr>
-        <w:br/>
-      </w:r>
-      <w:r>
-        <w:rPr>
-          <w:color w:val="000000" w:themeColor="text1"/>
-        </w:rPr>
-        <w:t>Felhasználó Kezelési Felület:</w:t>
-      </w:r>
-    </w:p>
-    <w:p>
-      <w:pPr>
-        <w:shd w:val="clear" w:color="auto" w:fill="FFFFFF" w:themeFill="background1"/>
-        <w:rPr>
-          <w:color w:val="000000" w:themeColor="text1"/>
-        </w:rPr>
-      </w:pPr>
-      <w:bookmarkStart w:id="0" w:name="_GoBack"/>
-      <w:bookmarkEnd w:id="0"/>
       <w:r>
         <w:rPr>
           <w:noProof/>
           <w:color w:val="000000" w:themeColor="text1"/>
         </w:rPr>
-        <w:lastRenderedPageBreak/>
+        <w:drawing>
+          <wp:anchor distT="0" distB="0" distL="114300" distR="114300" simplePos="0" relativeHeight="251664384" behindDoc="1" locked="0" layoutInCell="1" allowOverlap="1">
+            <wp:simplePos x="0" y="0"/>
+            <wp:positionH relativeFrom="page">
+              <wp:posOffset>3976382</wp:posOffset>
+            </wp:positionH>
+            <wp:positionV relativeFrom="paragraph">
+              <wp:posOffset>6343015</wp:posOffset>
+            </wp:positionV>
+            <wp:extent cx="3027680" cy="1701165"/>
+            <wp:effectExtent l="0" t="0" r="1270" b="0"/>
+            <wp:wrapTight wrapText="bothSides">
+              <wp:wrapPolygon edited="0">
+                <wp:start x="0" y="0"/>
+                <wp:lineTo x="0" y="21286"/>
+                <wp:lineTo x="21473" y="21286"/>
+                <wp:lineTo x="21473" y="0"/>
+                <wp:lineTo x="0" y="0"/>
+              </wp:wrapPolygon>
+            </wp:wrapTight>
+            <wp:docPr id="7" name="Kép 7"/>
+            <wp:cNvGraphicFramePr>
+              <a:graphicFrameLocks xmlns:a="http://schemas.openxmlformats.org/drawingml/2006/main" noChangeAspect="1"/>
+            </wp:cNvGraphicFramePr>
+            <a:graphic xmlns:a="http://schemas.openxmlformats.org/drawingml/2006/main">
+              <a:graphicData uri="http://schemas.openxmlformats.org/drawingml/2006/picture">
+                <pic:pic xmlns:pic="http://schemas.openxmlformats.org/drawingml/2006/picture">
+                  <pic:nvPicPr>
+                    <pic:cNvPr id="0" name="Picture 2"/>
+                    <pic:cNvPicPr>
+                      <a:picLocks noChangeAspect="1" noChangeArrowheads="1"/>
+                    </pic:cNvPicPr>
+                  </pic:nvPicPr>
+                  <pic:blipFill>
+                    <a:blip r:embed="rId5" cstate="print">
+                      <a:extLst>
+                        <a:ext uri="{28A0092B-C50C-407E-A947-70E740481C1C}">
+                          <a14:useLocalDpi xmlns:a14="http://schemas.microsoft.com/office/drawing/2010/main" val="0"/>
+                        </a:ext>
+                      </a:extLst>
+                    </a:blip>
+                    <a:srcRect/>
+                    <a:stretch>
+                      <a:fillRect/>
+                    </a:stretch>
+                  </pic:blipFill>
+                  <pic:spPr bwMode="auto">
+                    <a:xfrm>
+                      <a:off x="0" y="0"/>
+                      <a:ext cx="3027680" cy="1701165"/>
+                    </a:xfrm>
+                    <a:prstGeom prst="rect">
+                      <a:avLst/>
+                    </a:prstGeom>
+                    <a:noFill/>
+                    <a:ln>
+                      <a:noFill/>
+                    </a:ln>
+                  </pic:spPr>
+                </pic:pic>
+              </a:graphicData>
+            </a:graphic>
+            <wp14:sizeRelH relativeFrom="page">
+              <wp14:pctWidth>0</wp14:pctWidth>
+            </wp14:sizeRelH>
+            <wp14:sizeRelV relativeFrom="page">
+              <wp14:pctHeight>0</wp14:pctHeight>
+            </wp14:sizeRelV>
+          </wp:anchor>
+        </w:drawing>
+      </w:r>
+      <w:r>
+        <w:rPr>
+          <w:noProof/>
+          <w:color w:val="000000" w:themeColor="text1"/>
+        </w:rPr>
+        <w:drawing>
+          <wp:anchor distT="0" distB="0" distL="114300" distR="114300" simplePos="0" relativeHeight="251665408" behindDoc="1" locked="0" layoutInCell="1" allowOverlap="1">
+            <wp:simplePos x="0" y="0"/>
+            <wp:positionH relativeFrom="column">
+              <wp:posOffset>-364956</wp:posOffset>
+            </wp:positionH>
+            <wp:positionV relativeFrom="paragraph">
+              <wp:posOffset>6356815</wp:posOffset>
+            </wp:positionV>
+            <wp:extent cx="3001992" cy="1686525"/>
+            <wp:effectExtent l="0" t="0" r="8255" b="9525"/>
+            <wp:wrapTight wrapText="bothSides">
+              <wp:wrapPolygon edited="0">
+                <wp:start x="0" y="0"/>
+                <wp:lineTo x="0" y="21478"/>
+                <wp:lineTo x="21522" y="21478"/>
+                <wp:lineTo x="21522" y="0"/>
+                <wp:lineTo x="0" y="0"/>
+              </wp:wrapPolygon>
+            </wp:wrapTight>
+            <wp:docPr id="8" name="Kép 8"/>
+            <wp:cNvGraphicFramePr>
+              <a:graphicFrameLocks xmlns:a="http://schemas.openxmlformats.org/drawingml/2006/main" noChangeAspect="1"/>
+            </wp:cNvGraphicFramePr>
+            <a:graphic xmlns:a="http://schemas.openxmlformats.org/drawingml/2006/main">
+              <a:graphicData uri="http://schemas.openxmlformats.org/drawingml/2006/picture">
+                <pic:pic xmlns:pic="http://schemas.openxmlformats.org/drawingml/2006/picture">
+                  <pic:nvPicPr>
+                    <pic:cNvPr id="0" name="Picture 3"/>
+                    <pic:cNvPicPr>
+                      <a:picLocks noChangeAspect="1" noChangeArrowheads="1"/>
+                    </pic:cNvPicPr>
+                  </pic:nvPicPr>
+                  <pic:blipFill>
+                    <a:blip r:embed="rId6" cstate="print">
+                      <a:extLst>
+                        <a:ext uri="{28A0092B-C50C-407E-A947-70E740481C1C}">
+                          <a14:useLocalDpi xmlns:a14="http://schemas.microsoft.com/office/drawing/2010/main" val="0"/>
+                        </a:ext>
+                      </a:extLst>
+                    </a:blip>
+                    <a:srcRect/>
+                    <a:stretch>
+                      <a:fillRect/>
+                    </a:stretch>
+                  </pic:blipFill>
+                  <pic:spPr bwMode="auto">
+                    <a:xfrm>
+                      <a:off x="0" y="0"/>
+                      <a:ext cx="3001992" cy="1686525"/>
+                    </a:xfrm>
+                    <a:prstGeom prst="rect">
+                      <a:avLst/>
+                    </a:prstGeom>
+                    <a:noFill/>
+                    <a:ln>
+                      <a:noFill/>
+                    </a:ln>
+                  </pic:spPr>
+                </pic:pic>
+              </a:graphicData>
+            </a:graphic>
+            <wp14:sizeRelH relativeFrom="page">
+              <wp14:pctWidth>0</wp14:pctWidth>
+            </wp14:sizeRelH>
+            <wp14:sizeRelV relativeFrom="page">
+              <wp14:pctHeight>0</wp14:pctHeight>
+            </wp14:sizeRelV>
+          </wp:anchor>
+        </w:drawing>
+      </w:r>
+      <w:r>
+        <w:rPr>
+          <w:noProof/>
+          <w:color w:val="000000" w:themeColor="text1"/>
+        </w:rPr>
         <w:drawing>
           <wp:anchor distT="0" distB="0" distL="114300" distR="114300" simplePos="0" relativeHeight="251661312" behindDoc="1" locked="0" layoutInCell="1" allowOverlap="1">
             <wp:simplePos x="0" y="0"/>
             <wp:positionH relativeFrom="page">
-              <wp:posOffset>3826510</wp:posOffset>
+              <wp:posOffset>3788410</wp:posOffset>
             </wp:positionH>
             <wp:positionV relativeFrom="paragraph">
               <wp:posOffset>2224405</wp:posOffset>
@@ -399,7 +722,7 @@
                     <pic:cNvPicPr/>
                   </pic:nvPicPr>
                   <pic:blipFill>
-                    <a:blip r:embed="rId5" cstate="print">
+                    <a:blip r:embed="rId7" cstate="print">
                       <a:extLst>
                         <a:ext uri="{28A0092B-C50C-407E-A947-70E740481C1C}">
                           <a14:useLocalDpi xmlns:a14="http://schemas.microsoft.com/office/drawing/2010/main" val="0"/>
@@ -468,7 +791,7 @@
                     <pic:cNvPicPr/>
                   </pic:nvPicPr>
                   <pic:blipFill>
-                    <a:blip r:embed="rId6" cstate="print">
+                    <a:blip r:embed="rId8" cstate="print">
                       <a:extLst>
                         <a:ext uri="{28A0092B-C50C-407E-A947-70E740481C1C}">
                           <a14:useLocalDpi xmlns:a14="http://schemas.microsoft.com/office/drawing/2010/main" val="0"/>
@@ -537,7 +860,7 @@
                     <pic:cNvPicPr/>
                   </pic:nvPicPr>
                   <pic:blipFill>
-                    <a:blip r:embed="rId7" cstate="print">
+                    <a:blip r:embed="rId9" cstate="print">
                       <a:extLst>
                         <a:ext uri="{28A0092B-C50C-407E-A947-70E740481C1C}">
                           <a14:useLocalDpi xmlns:a14="http://schemas.microsoft.com/office/drawing/2010/main" val="0"/>
@@ -606,7 +929,7 @@
                     <pic:cNvPicPr/>
                   </pic:nvPicPr>
                   <pic:blipFill>
-                    <a:blip r:embed="rId8" cstate="print">
+                    <a:blip r:embed="rId10" cstate="print">
                       <a:extLst>
                         <a:ext uri="{28A0092B-C50C-407E-A947-70E740481C1C}">
                           <a14:useLocalDpi xmlns:a14="http://schemas.microsoft.com/office/drawing/2010/main" val="0"/>
@@ -646,33 +969,1886 @@
       </w:r>
       <w:r>
         <w:rPr>
-          <w:color w:val="000000" w:themeColor="text1"/>
-        </w:rPr>
-        <w:br/>
-      </w:r>
-      <w:r>
-        <w:rPr>
-          <w:color w:val="000000" w:themeColor="text1"/>
-        </w:rPr>
-        <w:br/>
-      </w:r>
-      <w:r>
-        <w:rPr>
-          <w:color w:val="000000" w:themeColor="text1"/>
-        </w:rPr>
-        <w:br/>
-      </w:r>
-      <w:r>
-        <w:rPr>
-          <w:color w:val="000000" w:themeColor="text1"/>
-        </w:rPr>
-        <w:br/>
-      </w:r>
-      <w:r>
-        <w:rPr>
-          <w:color w:val="000000" w:themeColor="text1"/>
-        </w:rPr>
-        <w:br/>
+          <w:rStyle w:val="Cmsor2Char"/>
+          <w:b/>
+        </w:rPr>
+        <w:t>Közösség kezelési felület:</w:t>
+      </w:r>
+      <w:r>
+        <w:rPr>
+          <w:color w:val="000000" w:themeColor="text1"/>
+        </w:rPr>
+        <w:br/>
+        <w:t>Ezen a felületen a táblázatban láthatja az összes közösségnek az adatait,</w:t>
+      </w:r>
+      <w:r>
+        <w:rPr>
+          <w:color w:val="000000" w:themeColor="text1"/>
+        </w:rPr>
+        <w:t xml:space="preserve"> a</w:t>
+      </w:r>
+      <w:r>
+        <w:rPr>
+          <w:color w:val="000000" w:themeColor="text1"/>
+        </w:rPr>
+        <w:t xml:space="preserve"> </w:t>
+      </w:r>
+      <w:r>
+        <w:rPr>
+          <w:color w:val="000000" w:themeColor="text1"/>
+        </w:rPr>
+        <w:t>kép</w:t>
+      </w:r>
+      <w:r>
+        <w:rPr>
+          <w:color w:val="000000" w:themeColor="text1"/>
+        </w:rPr>
+        <w:t xml:space="preserve"> kivételével.</w:t>
+      </w:r>
+      <w:r>
+        <w:rPr>
+          <w:color w:val="000000" w:themeColor="text1"/>
+        </w:rPr>
+        <w:br/>
+        <w:t xml:space="preserve">A Keresés felirat alatti fehér mezőben, kezdje el írni a keresett </w:t>
+      </w:r>
+      <w:r>
+        <w:rPr>
+          <w:color w:val="000000" w:themeColor="text1"/>
+        </w:rPr>
+        <w:t>közösség</w:t>
+      </w:r>
+      <w:r>
+        <w:rPr>
+          <w:color w:val="000000" w:themeColor="text1"/>
+        </w:rPr>
+        <w:t xml:space="preserve"> valamely adatát. Ez a táblázatból kiszűri a beírt adattal rendelkező közösséget.</w:t>
+      </w:r>
+      <w:r>
+        <w:rPr>
+          <w:color w:val="000000" w:themeColor="text1"/>
+        </w:rPr>
+        <w:br/>
+        <w:t xml:space="preserve">A táblázatban kattintson egy sorra, ezzel kiválasztva az adott </w:t>
+      </w:r>
+      <w:r>
+        <w:rPr>
+          <w:color w:val="000000" w:themeColor="text1"/>
+        </w:rPr>
+        <w:t>közösséget</w:t>
+      </w:r>
+      <w:r>
+        <w:rPr>
+          <w:color w:val="000000" w:themeColor="text1"/>
+        </w:rPr>
+        <w:t>.</w:t>
+      </w:r>
+      <w:r>
+        <w:rPr>
+          <w:color w:val="000000" w:themeColor="text1"/>
+        </w:rPr>
+        <w:br/>
+        <w:t xml:space="preserve">A táblázat alatt elhelyezkedő </w:t>
+      </w:r>
+      <w:proofErr w:type="spellStart"/>
+      <w:r>
+        <w:rPr>
+          <w:color w:val="000000" w:themeColor="text1"/>
+        </w:rPr>
+        <w:t>invalidálás</w:t>
+      </w:r>
+      <w:proofErr w:type="spellEnd"/>
+      <w:r>
+        <w:rPr>
+          <w:color w:val="000000" w:themeColor="text1"/>
+        </w:rPr>
+        <w:t>/</w:t>
+      </w:r>
+      <w:proofErr w:type="spellStart"/>
+      <w:r>
+        <w:rPr>
+          <w:color w:val="000000" w:themeColor="text1"/>
+        </w:rPr>
+        <w:t>validálás</w:t>
+      </w:r>
+      <w:proofErr w:type="spellEnd"/>
+      <w:r>
+        <w:rPr>
+          <w:color w:val="000000" w:themeColor="text1"/>
+        </w:rPr>
+        <w:t xml:space="preserve"> gombokkal állíthatja a közösség érvényességét.</w:t>
+      </w:r>
+      <w:r>
+        <w:rPr>
+          <w:color w:val="000000" w:themeColor="text1"/>
+        </w:rPr>
+        <w:br/>
+      </w:r>
+      <w:proofErr w:type="spellStart"/>
+      <w:r>
+        <w:rPr>
+          <w:color w:val="000000" w:themeColor="text1"/>
+        </w:rPr>
+        <w:t>Invalidálás</w:t>
+      </w:r>
+      <w:proofErr w:type="spellEnd"/>
+      <w:r>
+        <w:rPr>
+          <w:color w:val="000000" w:themeColor="text1"/>
+        </w:rPr>
+        <w:t xml:space="preserve"> =&gt; </w:t>
+      </w:r>
+      <w:proofErr w:type="spellStart"/>
+      <w:r>
+        <w:rPr>
+          <w:color w:val="000000" w:themeColor="text1"/>
+        </w:rPr>
+        <w:t>valid</w:t>
+      </w:r>
+      <w:proofErr w:type="spellEnd"/>
+      <w:r>
+        <w:rPr>
+          <w:color w:val="000000" w:themeColor="text1"/>
+        </w:rPr>
+        <w:t xml:space="preserve"> = 0 (érvénytelen) =&gt; Nem férnek hozzá a felhasználók</w:t>
+      </w:r>
+      <w:r>
+        <w:rPr>
+          <w:color w:val="000000" w:themeColor="text1"/>
+        </w:rPr>
+        <w:t>.</w:t>
+      </w:r>
+      <w:r>
+        <w:rPr>
+          <w:color w:val="000000" w:themeColor="text1"/>
+        </w:rPr>
+        <w:br/>
+      </w:r>
+      <w:proofErr w:type="spellStart"/>
+      <w:r>
+        <w:rPr>
+          <w:color w:val="000000" w:themeColor="text1"/>
+        </w:rPr>
+        <w:t>Validálás</w:t>
+      </w:r>
+      <w:proofErr w:type="spellEnd"/>
+      <w:r>
+        <w:rPr>
+          <w:color w:val="000000" w:themeColor="text1"/>
+        </w:rPr>
+        <w:t xml:space="preserve"> =&gt; </w:t>
+      </w:r>
+      <w:proofErr w:type="spellStart"/>
+      <w:r>
+        <w:rPr>
+          <w:color w:val="000000" w:themeColor="text1"/>
+        </w:rPr>
+        <w:t>valid</w:t>
+      </w:r>
+      <w:proofErr w:type="spellEnd"/>
+      <w:r>
+        <w:rPr>
+          <w:color w:val="000000" w:themeColor="text1"/>
+        </w:rPr>
+        <w:t xml:space="preserve"> = 1 (érvényes) =&gt; Hozzáférnek a felhasználók.</w:t>
+      </w:r>
+      <w:r>
+        <w:rPr>
+          <w:color w:val="000000" w:themeColor="text1"/>
+        </w:rPr>
+        <w:br/>
+        <w:t>Vissza gombra kattintáskor, bezáródik az oldal, a kezdőoldalra tér vissza.</w:t>
+      </w:r>
+      <w:r>
+        <w:rPr>
+          <w:color w:val="000000" w:themeColor="text1"/>
+        </w:rPr>
+        <w:br/>
+      </w:r>
+      <w:r>
+        <w:rPr>
+          <w:color w:val="000000" w:themeColor="text1"/>
+        </w:rPr>
+        <w:br/>
+      </w:r>
+      <w:r>
+        <w:rPr>
+          <w:color w:val="000000" w:themeColor="text1"/>
+        </w:rPr>
+        <w:br/>
+      </w:r>
+      <w:r>
+        <w:rPr>
+          <w:color w:val="000000" w:themeColor="text1"/>
+        </w:rPr>
+        <w:br/>
+      </w:r>
+      <w:r>
+        <w:rPr>
+          <w:color w:val="000000" w:themeColor="text1"/>
+        </w:rPr>
+        <w:br/>
+      </w:r>
+      <w:r>
+        <w:rPr>
+          <w:color w:val="000000" w:themeColor="text1"/>
+        </w:rPr>
+        <w:br/>
+      </w:r>
+      <w:r>
+        <w:rPr>
+          <w:color w:val="000000" w:themeColor="text1"/>
+        </w:rPr>
+        <w:br/>
+      </w:r>
+      <w:r>
+        <w:rPr>
+          <w:color w:val="000000" w:themeColor="text1"/>
+        </w:rPr>
+        <w:br/>
+      </w:r>
+      <w:r>
+        <w:rPr>
+          <w:noProof/>
+          <w:color w:val="000000" w:themeColor="text1"/>
+        </w:rPr>
+        <w:lastRenderedPageBreak/>
+        <w:drawing>
+          <wp:anchor distT="0" distB="0" distL="114300" distR="114300" simplePos="0" relativeHeight="251675648" behindDoc="1" locked="0" layoutInCell="1" allowOverlap="1" wp14:anchorId="2F033E9B" wp14:editId="2A857D14">
+            <wp:simplePos x="0" y="0"/>
+            <wp:positionH relativeFrom="margin">
+              <wp:posOffset>396408</wp:posOffset>
+            </wp:positionH>
+            <wp:positionV relativeFrom="paragraph">
+              <wp:posOffset>527</wp:posOffset>
+            </wp:positionV>
+            <wp:extent cx="5012690" cy="2817495"/>
+            <wp:effectExtent l="0" t="0" r="0" b="1905"/>
+            <wp:wrapTight wrapText="bothSides">
+              <wp:wrapPolygon edited="0">
+                <wp:start x="0" y="0"/>
+                <wp:lineTo x="0" y="21469"/>
+                <wp:lineTo x="21507" y="21469"/>
+                <wp:lineTo x="21507" y="0"/>
+                <wp:lineTo x="0" y="0"/>
+              </wp:wrapPolygon>
+            </wp:wrapTight>
+            <wp:docPr id="6" name="Kép 6"/>
+            <wp:cNvGraphicFramePr>
+              <a:graphicFrameLocks xmlns:a="http://schemas.openxmlformats.org/drawingml/2006/main" noChangeAspect="1"/>
+            </wp:cNvGraphicFramePr>
+            <a:graphic xmlns:a="http://schemas.openxmlformats.org/drawingml/2006/main">
+              <a:graphicData uri="http://schemas.openxmlformats.org/drawingml/2006/picture">
+                <pic:pic xmlns:pic="http://schemas.openxmlformats.org/drawingml/2006/picture">
+                  <pic:nvPicPr>
+                    <pic:cNvPr id="0" name="Picture 1"/>
+                    <pic:cNvPicPr>
+                      <a:picLocks noChangeAspect="1" noChangeArrowheads="1"/>
+                    </pic:cNvPicPr>
+                  </pic:nvPicPr>
+                  <pic:blipFill>
+                    <a:blip r:embed="rId11" cstate="print">
+                      <a:extLst>
+                        <a:ext uri="{28A0092B-C50C-407E-A947-70E740481C1C}">
+                          <a14:useLocalDpi xmlns:a14="http://schemas.microsoft.com/office/drawing/2010/main" val="0"/>
+                        </a:ext>
+                      </a:extLst>
+                    </a:blip>
+                    <a:srcRect/>
+                    <a:stretch>
+                      <a:fillRect/>
+                    </a:stretch>
+                  </pic:blipFill>
+                  <pic:spPr bwMode="auto">
+                    <a:xfrm>
+                      <a:off x="0" y="0"/>
+                      <a:ext cx="5012690" cy="2817495"/>
+                    </a:xfrm>
+                    <a:prstGeom prst="rect">
+                      <a:avLst/>
+                    </a:prstGeom>
+                    <a:noFill/>
+                    <a:ln>
+                      <a:noFill/>
+                    </a:ln>
+                  </pic:spPr>
+                </pic:pic>
+              </a:graphicData>
+            </a:graphic>
+            <wp14:sizeRelH relativeFrom="page">
+              <wp14:pctWidth>0</wp14:pctWidth>
+            </wp14:sizeRelH>
+            <wp14:sizeRelV relativeFrom="page">
+              <wp14:pctHeight>0</wp14:pctHeight>
+            </wp14:sizeRelV>
+          </wp:anchor>
+        </w:drawing>
+      </w:r>
+      <w:r>
+        <w:rPr>
+          <w:color w:val="000000" w:themeColor="text1"/>
+        </w:rPr>
+        <w:br/>
+      </w:r>
+      <w:r>
+        <w:rPr>
+          <w:color w:val="000000" w:themeColor="text1"/>
+        </w:rPr>
+        <w:br/>
+      </w:r>
+      <w:r>
+        <w:rPr>
+          <w:color w:val="000000" w:themeColor="text1"/>
+        </w:rPr>
+        <w:br/>
+      </w:r>
+      <w:r>
+        <w:rPr>
+          <w:color w:val="000000" w:themeColor="text1"/>
+        </w:rPr>
+        <w:br/>
+      </w:r>
+      <w:r>
+        <w:rPr>
+          <w:color w:val="000000" w:themeColor="text1"/>
+        </w:rPr>
+        <w:br/>
+      </w:r>
+      <w:r>
+        <w:rPr>
+          <w:color w:val="000000" w:themeColor="text1"/>
+        </w:rPr>
+        <w:br/>
+      </w:r>
+      <w:r>
+        <w:rPr>
+          <w:color w:val="000000" w:themeColor="text1"/>
+        </w:rPr>
+        <w:br/>
+      </w:r>
+      <w:r>
+        <w:rPr>
+          <w:color w:val="000000" w:themeColor="text1"/>
+        </w:rPr>
+        <w:br/>
+      </w:r>
+      <w:r>
+        <w:rPr>
+          <w:color w:val="000000" w:themeColor="text1"/>
+        </w:rPr>
+        <w:br/>
+      </w:r>
+      <w:r>
+        <w:rPr>
+          <w:color w:val="000000" w:themeColor="text1"/>
+        </w:rPr>
+        <w:br/>
+      </w:r>
+      <w:r>
+        <w:rPr>
+          <w:color w:val="000000" w:themeColor="text1"/>
+        </w:rPr>
+        <w:br/>
+      </w:r>
+      <w:r>
+        <w:rPr>
+          <w:color w:val="000000" w:themeColor="text1"/>
+        </w:rPr>
+        <w:br/>
+      </w:r>
+      <w:r>
+        <w:rPr>
+          <w:color w:val="000000" w:themeColor="text1"/>
+        </w:rPr>
+        <w:br/>
+      </w:r>
+      <w:r>
+        <w:rPr>
+          <w:color w:val="000000" w:themeColor="text1"/>
+        </w:rPr>
+        <w:br/>
+      </w:r>
+      <w:r>
+        <w:rPr>
+          <w:color w:val="000000" w:themeColor="text1"/>
+        </w:rPr>
+        <w:br/>
+      </w:r>
+      <w:r>
+        <w:rPr>
+          <w:color w:val="000000" w:themeColor="text1"/>
+        </w:rPr>
+        <w:br/>
+      </w:r>
+      <w:r>
+        <w:rPr>
+          <w:color w:val="000000" w:themeColor="text1"/>
+        </w:rPr>
+        <w:br/>
+      </w:r>
+      <w:r>
+        <w:rPr>
+          <w:color w:val="000000" w:themeColor="text1"/>
+        </w:rPr>
+        <w:br/>
+      </w:r>
+      <w:r>
+        <w:rPr>
+          <w:color w:val="000000" w:themeColor="text1"/>
+        </w:rPr>
+        <w:br/>
+      </w:r>
+      <w:r>
+        <w:rPr>
+          <w:color w:val="000000" w:themeColor="text1"/>
+        </w:rPr>
+        <w:br/>
+      </w:r>
+      <w:r>
+        <w:rPr>
+          <w:color w:val="000000" w:themeColor="text1"/>
+        </w:rPr>
+        <w:br/>
+      </w:r>
+      <w:r>
+        <w:rPr>
+          <w:rStyle w:val="Cmsor2Char"/>
+          <w:b/>
+        </w:rPr>
+        <w:br/>
+      </w:r>
+      <w:r>
+        <w:rPr>
+          <w:rStyle w:val="Cmsor2Char"/>
+          <w:b/>
+        </w:rPr>
+        <w:br/>
+      </w:r>
+      <w:r>
+        <w:rPr>
+          <w:rStyle w:val="Cmsor2Char"/>
+          <w:b/>
+        </w:rPr>
+        <w:br/>
+      </w:r>
+      <w:r>
+        <w:rPr>
+          <w:rStyle w:val="Cmsor2Char"/>
+          <w:b/>
+        </w:rPr>
+        <w:br/>
+      </w:r>
+      <w:r>
+        <w:rPr>
+          <w:rStyle w:val="Cmsor2Char"/>
+          <w:b/>
+        </w:rPr>
+        <w:br/>
+      </w:r>
+      <w:r>
+        <w:rPr>
+          <w:rStyle w:val="Cmsor2Char"/>
+          <w:b/>
+        </w:rPr>
+        <w:t>Poszt Ke</w:t>
+      </w:r>
+      <w:r>
+        <w:rPr>
+          <w:rStyle w:val="Cmsor2Char"/>
+          <w:b/>
+        </w:rPr>
+        <w:t>zel</w:t>
+      </w:r>
+      <w:r>
+        <w:rPr>
+          <w:rStyle w:val="Cmsor2Char"/>
+          <w:b/>
+        </w:rPr>
+        <w:t>ési Felület:</w:t>
+      </w:r>
+      <w:r>
+        <w:rPr>
+          <w:color w:val="000000" w:themeColor="text1"/>
+        </w:rPr>
+        <w:br/>
+      </w:r>
+      <w:r>
+        <w:rPr>
+          <w:color w:val="000000" w:themeColor="text1"/>
+        </w:rPr>
+        <w:t xml:space="preserve">Ezen a felületen a táblázatban láthatja az összes </w:t>
+      </w:r>
+      <w:r>
+        <w:rPr>
+          <w:color w:val="000000" w:themeColor="text1"/>
+        </w:rPr>
+        <w:t>posztnak</w:t>
+      </w:r>
+      <w:r>
+        <w:rPr>
+          <w:color w:val="000000" w:themeColor="text1"/>
+        </w:rPr>
+        <w:t xml:space="preserve"> az adatait, a</w:t>
+      </w:r>
+      <w:r>
+        <w:rPr>
+          <w:color w:val="000000" w:themeColor="text1"/>
+        </w:rPr>
+        <w:t xml:space="preserve"> </w:t>
+      </w:r>
+      <w:r>
+        <w:rPr>
+          <w:color w:val="000000" w:themeColor="text1"/>
+        </w:rPr>
+        <w:t>kép kivételével.</w:t>
+      </w:r>
+      <w:r>
+        <w:rPr>
+          <w:color w:val="000000" w:themeColor="text1"/>
+        </w:rPr>
+        <w:br/>
+        <w:t>A Keresés felirat alatti fehér mezőben, kezdje el írni a keresett</w:t>
+      </w:r>
+      <w:r>
+        <w:rPr>
+          <w:color w:val="000000" w:themeColor="text1"/>
+        </w:rPr>
+        <w:t xml:space="preserve"> poszt</w:t>
+      </w:r>
+      <w:r>
+        <w:rPr>
+          <w:color w:val="000000" w:themeColor="text1"/>
+        </w:rPr>
+        <w:t xml:space="preserve"> valamely adatát. Ez a táblázatból kiszűri a beírt adattal rendelkező </w:t>
+      </w:r>
+      <w:r>
+        <w:rPr>
+          <w:color w:val="000000" w:themeColor="text1"/>
+        </w:rPr>
+        <w:t>posztot</w:t>
+      </w:r>
+      <w:r>
+        <w:rPr>
+          <w:color w:val="000000" w:themeColor="text1"/>
+        </w:rPr>
+        <w:t>.</w:t>
+      </w:r>
+      <w:r>
+        <w:rPr>
+          <w:color w:val="000000" w:themeColor="text1"/>
+        </w:rPr>
+        <w:br/>
+        <w:t xml:space="preserve">A táblázatban kattintson egy sorra, ezzel kiválasztva az adott </w:t>
+      </w:r>
+      <w:r>
+        <w:rPr>
+          <w:color w:val="000000" w:themeColor="text1"/>
+        </w:rPr>
+        <w:t>posztot</w:t>
+      </w:r>
+      <w:r>
+        <w:rPr>
+          <w:color w:val="000000" w:themeColor="text1"/>
+        </w:rPr>
+        <w:t>.</w:t>
+      </w:r>
+      <w:r>
+        <w:rPr>
+          <w:color w:val="000000" w:themeColor="text1"/>
+        </w:rPr>
+        <w:br/>
+        <w:t xml:space="preserve">A táblázat alatt elhelyezkedő </w:t>
+      </w:r>
+      <w:proofErr w:type="spellStart"/>
+      <w:r>
+        <w:rPr>
+          <w:color w:val="000000" w:themeColor="text1"/>
+        </w:rPr>
+        <w:t>invalidálás</w:t>
+      </w:r>
+      <w:proofErr w:type="spellEnd"/>
+      <w:r>
+        <w:rPr>
+          <w:color w:val="000000" w:themeColor="text1"/>
+        </w:rPr>
+        <w:t>/</w:t>
+      </w:r>
+      <w:proofErr w:type="spellStart"/>
+      <w:r>
+        <w:rPr>
+          <w:color w:val="000000" w:themeColor="text1"/>
+        </w:rPr>
+        <w:t>validálás</w:t>
+      </w:r>
+      <w:proofErr w:type="spellEnd"/>
+      <w:r>
+        <w:rPr>
+          <w:color w:val="000000" w:themeColor="text1"/>
+        </w:rPr>
+        <w:t xml:space="preserve"> gombokkal állíthatja a </w:t>
+      </w:r>
+      <w:r>
+        <w:rPr>
+          <w:color w:val="000000" w:themeColor="text1"/>
+        </w:rPr>
+        <w:t>poszt</w:t>
+      </w:r>
+      <w:r>
+        <w:rPr>
+          <w:color w:val="000000" w:themeColor="text1"/>
+        </w:rPr>
+        <w:t xml:space="preserve"> érvényességét.</w:t>
+      </w:r>
+      <w:r>
+        <w:rPr>
+          <w:color w:val="000000" w:themeColor="text1"/>
+        </w:rPr>
+        <w:br/>
+      </w:r>
+      <w:proofErr w:type="spellStart"/>
+      <w:r>
+        <w:rPr>
+          <w:color w:val="000000" w:themeColor="text1"/>
+        </w:rPr>
+        <w:t>Invalidálás</w:t>
+      </w:r>
+      <w:proofErr w:type="spellEnd"/>
+      <w:r>
+        <w:rPr>
+          <w:color w:val="000000" w:themeColor="text1"/>
+        </w:rPr>
+        <w:t xml:space="preserve"> =&gt; </w:t>
+      </w:r>
+      <w:proofErr w:type="spellStart"/>
+      <w:r>
+        <w:rPr>
+          <w:color w:val="000000" w:themeColor="text1"/>
+        </w:rPr>
+        <w:t>valid</w:t>
+      </w:r>
+      <w:proofErr w:type="spellEnd"/>
+      <w:r>
+        <w:rPr>
+          <w:color w:val="000000" w:themeColor="text1"/>
+        </w:rPr>
+        <w:t xml:space="preserve"> = 0 (érvénytelen) =&gt; Nem férnek hozzá a felhasználók.</w:t>
+      </w:r>
+      <w:r>
+        <w:rPr>
+          <w:color w:val="000000" w:themeColor="text1"/>
+        </w:rPr>
+        <w:br/>
+      </w:r>
+      <w:proofErr w:type="spellStart"/>
+      <w:r>
+        <w:rPr>
+          <w:color w:val="000000" w:themeColor="text1"/>
+        </w:rPr>
+        <w:t>Validálás</w:t>
+      </w:r>
+      <w:proofErr w:type="spellEnd"/>
+      <w:r>
+        <w:rPr>
+          <w:color w:val="000000" w:themeColor="text1"/>
+        </w:rPr>
+        <w:t xml:space="preserve"> =&gt; </w:t>
+      </w:r>
+      <w:proofErr w:type="spellStart"/>
+      <w:r>
+        <w:rPr>
+          <w:color w:val="000000" w:themeColor="text1"/>
+        </w:rPr>
+        <w:t>valid</w:t>
+      </w:r>
+      <w:proofErr w:type="spellEnd"/>
+      <w:r>
+        <w:rPr>
+          <w:color w:val="000000" w:themeColor="text1"/>
+        </w:rPr>
+        <w:t xml:space="preserve"> = 1 (érvényes) =&gt; Hozzáférnek a felhasználók.</w:t>
+      </w:r>
+      <w:r>
+        <w:rPr>
+          <w:color w:val="000000" w:themeColor="text1"/>
+        </w:rPr>
+        <w:br/>
+        <w:t>Vissza gombra kattintáskor, bezáródik az oldal, a kezdőoldalra tér vissza.</w:t>
+      </w:r>
+      <w:r>
+        <w:rPr>
+          <w:color w:val="000000" w:themeColor="text1"/>
+        </w:rPr>
+        <w:br/>
+      </w:r>
+      <w:r>
+        <w:rPr>
+          <w:noProof/>
+          <w:color w:val="000000" w:themeColor="text1"/>
+        </w:rPr>
+        <w:drawing>
+          <wp:anchor distT="0" distB="0" distL="114300" distR="114300" simplePos="0" relativeHeight="251668480" behindDoc="1" locked="0" layoutInCell="1" allowOverlap="1">
+            <wp:simplePos x="0" y="0"/>
+            <wp:positionH relativeFrom="margin">
+              <wp:align>center</wp:align>
+            </wp:positionH>
+            <wp:positionV relativeFrom="paragraph">
+              <wp:posOffset>7213444</wp:posOffset>
+            </wp:positionV>
+            <wp:extent cx="2981960" cy="1675765"/>
+            <wp:effectExtent l="0" t="0" r="8890" b="635"/>
+            <wp:wrapTight wrapText="bothSides">
+              <wp:wrapPolygon edited="0">
+                <wp:start x="0" y="0"/>
+                <wp:lineTo x="0" y="21363"/>
+                <wp:lineTo x="21526" y="21363"/>
+                <wp:lineTo x="21526" y="0"/>
+                <wp:lineTo x="0" y="0"/>
+              </wp:wrapPolygon>
+            </wp:wrapTight>
+            <wp:docPr id="14" name="Kép 14"/>
+            <wp:cNvGraphicFramePr>
+              <a:graphicFrameLocks xmlns:a="http://schemas.openxmlformats.org/drawingml/2006/main" noChangeAspect="1"/>
+            </wp:cNvGraphicFramePr>
+            <a:graphic xmlns:a="http://schemas.openxmlformats.org/drawingml/2006/main">
+              <a:graphicData uri="http://schemas.openxmlformats.org/drawingml/2006/picture">
+                <pic:pic xmlns:pic="http://schemas.openxmlformats.org/drawingml/2006/picture">
+                  <pic:nvPicPr>
+                    <pic:cNvPr id="0" name="Picture 6"/>
+                    <pic:cNvPicPr>
+                      <a:picLocks noChangeAspect="1" noChangeArrowheads="1"/>
+                    </pic:cNvPicPr>
+                  </pic:nvPicPr>
+                  <pic:blipFill>
+                    <a:blip r:embed="rId12" cstate="print">
+                      <a:extLst>
+                        <a:ext uri="{28A0092B-C50C-407E-A947-70E740481C1C}">
+                          <a14:useLocalDpi xmlns:a14="http://schemas.microsoft.com/office/drawing/2010/main" val="0"/>
+                        </a:ext>
+                      </a:extLst>
+                    </a:blip>
+                    <a:srcRect/>
+                    <a:stretch>
+                      <a:fillRect/>
+                    </a:stretch>
+                  </pic:blipFill>
+                  <pic:spPr bwMode="auto">
+                    <a:xfrm>
+                      <a:off x="0" y="0"/>
+                      <a:ext cx="2981960" cy="1675765"/>
+                    </a:xfrm>
+                    <a:prstGeom prst="rect">
+                      <a:avLst/>
+                    </a:prstGeom>
+                    <a:noFill/>
+                    <a:ln>
+                      <a:noFill/>
+                    </a:ln>
+                  </pic:spPr>
+                </pic:pic>
+              </a:graphicData>
+            </a:graphic>
+            <wp14:sizeRelH relativeFrom="page">
+              <wp14:pctWidth>0</wp14:pctWidth>
+            </wp14:sizeRelH>
+            <wp14:sizeRelV relativeFrom="page">
+              <wp14:pctHeight>0</wp14:pctHeight>
+            </wp14:sizeRelV>
+          </wp:anchor>
+        </w:drawing>
+      </w:r>
+      <w:r>
+        <w:rPr>
+          <w:noProof/>
+          <w:color w:val="000000" w:themeColor="text1"/>
+        </w:rPr>
+        <w:drawing>
+          <wp:anchor distT="0" distB="0" distL="114300" distR="114300" simplePos="0" relativeHeight="251667456" behindDoc="1" locked="0" layoutInCell="1" allowOverlap="1">
+            <wp:simplePos x="0" y="0"/>
+            <wp:positionH relativeFrom="page">
+              <wp:posOffset>3829050</wp:posOffset>
+            </wp:positionH>
+            <wp:positionV relativeFrom="paragraph">
+              <wp:posOffset>5034280</wp:posOffset>
+            </wp:positionV>
+            <wp:extent cx="3638550" cy="2044065"/>
+            <wp:effectExtent l="0" t="0" r="0" b="0"/>
+            <wp:wrapTight wrapText="bothSides">
+              <wp:wrapPolygon edited="0">
+                <wp:start x="0" y="0"/>
+                <wp:lineTo x="0" y="21338"/>
+                <wp:lineTo x="21487" y="21338"/>
+                <wp:lineTo x="21487" y="0"/>
+                <wp:lineTo x="0" y="0"/>
+              </wp:wrapPolygon>
+            </wp:wrapTight>
+            <wp:docPr id="13" name="Kép 13"/>
+            <wp:cNvGraphicFramePr>
+              <a:graphicFrameLocks xmlns:a="http://schemas.openxmlformats.org/drawingml/2006/main" noChangeAspect="1"/>
+            </wp:cNvGraphicFramePr>
+            <a:graphic xmlns:a="http://schemas.openxmlformats.org/drawingml/2006/main">
+              <a:graphicData uri="http://schemas.openxmlformats.org/drawingml/2006/picture">
+                <pic:pic xmlns:pic="http://schemas.openxmlformats.org/drawingml/2006/picture">
+                  <pic:nvPicPr>
+                    <pic:cNvPr id="0" name="Picture 5"/>
+                    <pic:cNvPicPr>
+                      <a:picLocks noChangeAspect="1" noChangeArrowheads="1"/>
+                    </pic:cNvPicPr>
+                  </pic:nvPicPr>
+                  <pic:blipFill>
+                    <a:blip r:embed="rId13" cstate="print">
+                      <a:extLst>
+                        <a:ext uri="{28A0092B-C50C-407E-A947-70E740481C1C}">
+                          <a14:useLocalDpi xmlns:a14="http://schemas.microsoft.com/office/drawing/2010/main" val="0"/>
+                        </a:ext>
+                      </a:extLst>
+                    </a:blip>
+                    <a:srcRect/>
+                    <a:stretch>
+                      <a:fillRect/>
+                    </a:stretch>
+                  </pic:blipFill>
+                  <pic:spPr bwMode="auto">
+                    <a:xfrm>
+                      <a:off x="0" y="0"/>
+                      <a:ext cx="3638550" cy="2044065"/>
+                    </a:xfrm>
+                    <a:prstGeom prst="rect">
+                      <a:avLst/>
+                    </a:prstGeom>
+                    <a:noFill/>
+                    <a:ln>
+                      <a:noFill/>
+                    </a:ln>
+                  </pic:spPr>
+                </pic:pic>
+              </a:graphicData>
+            </a:graphic>
+            <wp14:sizeRelH relativeFrom="page">
+              <wp14:pctWidth>0</wp14:pctWidth>
+            </wp14:sizeRelH>
+            <wp14:sizeRelV relativeFrom="page">
+              <wp14:pctHeight>0</wp14:pctHeight>
+            </wp14:sizeRelV>
+          </wp:anchor>
+        </w:drawing>
+      </w:r>
+      <w:r>
+        <w:rPr>
+          <w:noProof/>
+          <w:color w:val="000000" w:themeColor="text1"/>
+        </w:rPr>
+        <w:drawing>
+          <wp:anchor distT="0" distB="0" distL="114300" distR="114300" simplePos="0" relativeHeight="251666432" behindDoc="1" locked="0" layoutInCell="1" allowOverlap="1">
+            <wp:simplePos x="0" y="0"/>
+            <wp:positionH relativeFrom="margin">
+              <wp:posOffset>-814070</wp:posOffset>
+            </wp:positionH>
+            <wp:positionV relativeFrom="paragraph">
+              <wp:posOffset>5034280</wp:posOffset>
+            </wp:positionV>
+            <wp:extent cx="3648075" cy="2049780"/>
+            <wp:effectExtent l="0" t="0" r="9525" b="7620"/>
+            <wp:wrapTight wrapText="bothSides">
+              <wp:wrapPolygon edited="0">
+                <wp:start x="0" y="0"/>
+                <wp:lineTo x="0" y="21480"/>
+                <wp:lineTo x="21544" y="21480"/>
+                <wp:lineTo x="21544" y="0"/>
+                <wp:lineTo x="0" y="0"/>
+              </wp:wrapPolygon>
+            </wp:wrapTight>
+            <wp:docPr id="12" name="Kép 12"/>
+            <wp:cNvGraphicFramePr>
+              <a:graphicFrameLocks xmlns:a="http://schemas.openxmlformats.org/drawingml/2006/main" noChangeAspect="1"/>
+            </wp:cNvGraphicFramePr>
+            <a:graphic xmlns:a="http://schemas.openxmlformats.org/drawingml/2006/main">
+              <a:graphicData uri="http://schemas.openxmlformats.org/drawingml/2006/picture">
+                <pic:pic xmlns:pic="http://schemas.openxmlformats.org/drawingml/2006/picture">
+                  <pic:nvPicPr>
+                    <pic:cNvPr id="0" name="Picture 4"/>
+                    <pic:cNvPicPr>
+                      <a:picLocks noChangeAspect="1" noChangeArrowheads="1"/>
+                    </pic:cNvPicPr>
+                  </pic:nvPicPr>
+                  <pic:blipFill>
+                    <a:blip r:embed="rId14" cstate="print">
+                      <a:extLst>
+                        <a:ext uri="{28A0092B-C50C-407E-A947-70E740481C1C}">
+                          <a14:useLocalDpi xmlns:a14="http://schemas.microsoft.com/office/drawing/2010/main" val="0"/>
+                        </a:ext>
+                      </a:extLst>
+                    </a:blip>
+                    <a:srcRect/>
+                    <a:stretch>
+                      <a:fillRect/>
+                    </a:stretch>
+                  </pic:blipFill>
+                  <pic:spPr bwMode="auto">
+                    <a:xfrm>
+                      <a:off x="0" y="0"/>
+                      <a:ext cx="3648075" cy="2049780"/>
+                    </a:xfrm>
+                    <a:prstGeom prst="rect">
+                      <a:avLst/>
+                    </a:prstGeom>
+                    <a:noFill/>
+                    <a:ln>
+                      <a:noFill/>
+                    </a:ln>
+                  </pic:spPr>
+                </pic:pic>
+              </a:graphicData>
+            </a:graphic>
+            <wp14:sizeRelH relativeFrom="page">
+              <wp14:pctWidth>0</wp14:pctWidth>
+            </wp14:sizeRelH>
+            <wp14:sizeRelV relativeFrom="page">
+              <wp14:pctHeight>0</wp14:pctHeight>
+            </wp14:sizeRelV>
+          </wp:anchor>
+        </w:drawing>
+      </w:r>
+      <w:r>
+        <w:rPr>
+          <w:color w:val="000000" w:themeColor="text1"/>
+        </w:rPr>
+        <w:br/>
+      </w:r>
+      <w:r>
+        <w:rPr>
+          <w:color w:val="000000" w:themeColor="text1"/>
+        </w:rPr>
+        <w:br/>
+      </w:r>
+    </w:p>
+    <w:p>
+      <w:pPr>
+        <w:shd w:val="clear" w:color="auto" w:fill="FFFFFF" w:themeFill="background1"/>
+        <w:rPr>
+          <w:color w:val="000000" w:themeColor="text1"/>
+        </w:rPr>
+      </w:pPr>
+    </w:p>
+    <w:p>
+      <w:pPr>
+        <w:shd w:val="clear" w:color="auto" w:fill="FFFFFF" w:themeFill="background1"/>
+        <w:rPr>
+          <w:color w:val="000000" w:themeColor="text1"/>
+        </w:rPr>
+      </w:pPr>
+    </w:p>
+    <w:p>
+      <w:pPr>
+        <w:shd w:val="clear" w:color="auto" w:fill="FFFFFF" w:themeFill="background1"/>
+        <w:rPr>
+          <w:color w:val="000000" w:themeColor="text1"/>
+        </w:rPr>
+      </w:pPr>
+    </w:p>
+    <w:p>
+      <w:pPr>
+        <w:shd w:val="clear" w:color="auto" w:fill="FFFFFF" w:themeFill="background1"/>
+        <w:rPr>
+          <w:color w:val="000000" w:themeColor="text1"/>
+        </w:rPr>
+      </w:pPr>
+    </w:p>
+    <w:p>
+      <w:pPr>
+        <w:shd w:val="clear" w:color="auto" w:fill="FFFFFF" w:themeFill="background1"/>
+        <w:rPr>
+          <w:color w:val="000000" w:themeColor="text1"/>
+        </w:rPr>
+      </w:pPr>
+    </w:p>
+    <w:p>
+      <w:pPr>
+        <w:shd w:val="clear" w:color="auto" w:fill="FFFFFF" w:themeFill="background1"/>
+        <w:rPr>
+          <w:color w:val="000000" w:themeColor="text1"/>
+        </w:rPr>
+      </w:pPr>
+      <w:r>
+        <w:rPr>
+          <w:rStyle w:val="Cmsor2Char"/>
+          <w:b/>
+        </w:rPr>
+        <w:drawing>
+          <wp:anchor distT="0" distB="0" distL="114300" distR="114300" simplePos="0" relativeHeight="251670528" behindDoc="1" locked="0" layoutInCell="1" allowOverlap="1">
+            <wp:simplePos x="0" y="0"/>
+            <wp:positionH relativeFrom="margin">
+              <wp:posOffset>2928620</wp:posOffset>
+            </wp:positionH>
+            <wp:positionV relativeFrom="paragraph">
+              <wp:posOffset>1851025</wp:posOffset>
+            </wp:positionV>
+            <wp:extent cx="3647440" cy="2052955"/>
+            <wp:effectExtent l="0" t="0" r="0" b="4445"/>
+            <wp:wrapTight wrapText="bothSides">
+              <wp:wrapPolygon edited="0">
+                <wp:start x="0" y="0"/>
+                <wp:lineTo x="0" y="21446"/>
+                <wp:lineTo x="21435" y="21446"/>
+                <wp:lineTo x="21435" y="0"/>
+                <wp:lineTo x="0" y="0"/>
+              </wp:wrapPolygon>
+            </wp:wrapTight>
+            <wp:docPr id="16" name="Kép 16"/>
+            <wp:cNvGraphicFramePr>
+              <a:graphicFrameLocks xmlns:a="http://schemas.openxmlformats.org/drawingml/2006/main" noChangeAspect="1"/>
+            </wp:cNvGraphicFramePr>
+            <a:graphic xmlns:a="http://schemas.openxmlformats.org/drawingml/2006/main">
+              <a:graphicData uri="http://schemas.openxmlformats.org/drawingml/2006/picture">
+                <pic:pic xmlns:pic="http://schemas.openxmlformats.org/drawingml/2006/picture">
+                  <pic:nvPicPr>
+                    <pic:cNvPr id="0" name="Picture 8"/>
+                    <pic:cNvPicPr>
+                      <a:picLocks noChangeAspect="1" noChangeArrowheads="1"/>
+                    </pic:cNvPicPr>
+                  </pic:nvPicPr>
+                  <pic:blipFill>
+                    <a:blip r:embed="rId15" cstate="print">
+                      <a:extLst>
+                        <a:ext uri="{28A0092B-C50C-407E-A947-70E740481C1C}">
+                          <a14:useLocalDpi xmlns:a14="http://schemas.microsoft.com/office/drawing/2010/main" val="0"/>
+                        </a:ext>
+                      </a:extLst>
+                    </a:blip>
+                    <a:srcRect/>
+                    <a:stretch>
+                      <a:fillRect/>
+                    </a:stretch>
+                  </pic:blipFill>
+                  <pic:spPr bwMode="auto">
+                    <a:xfrm>
+                      <a:off x="0" y="0"/>
+                      <a:ext cx="3647440" cy="2052955"/>
+                    </a:xfrm>
+                    <a:prstGeom prst="rect">
+                      <a:avLst/>
+                    </a:prstGeom>
+                    <a:noFill/>
+                    <a:ln>
+                      <a:noFill/>
+                    </a:ln>
+                  </pic:spPr>
+                </pic:pic>
+              </a:graphicData>
+            </a:graphic>
+            <wp14:sizeRelH relativeFrom="page">
+              <wp14:pctWidth>0</wp14:pctWidth>
+            </wp14:sizeRelH>
+            <wp14:sizeRelV relativeFrom="page">
+              <wp14:pctHeight>0</wp14:pctHeight>
+            </wp14:sizeRelV>
+          </wp:anchor>
+        </w:drawing>
+      </w:r>
+      <w:r>
+        <w:rPr>
+          <w:rStyle w:val="Cmsor2Char"/>
+          <w:b/>
+        </w:rPr>
+        <w:drawing>
+          <wp:anchor distT="0" distB="0" distL="114300" distR="114300" simplePos="0" relativeHeight="251669504" behindDoc="1" locked="0" layoutInCell="1" allowOverlap="1">
+            <wp:simplePos x="0" y="0"/>
+            <wp:positionH relativeFrom="page">
+              <wp:posOffset>128905</wp:posOffset>
+            </wp:positionH>
+            <wp:positionV relativeFrom="paragraph">
+              <wp:posOffset>1851660</wp:posOffset>
+            </wp:positionV>
+            <wp:extent cx="3657600" cy="2058035"/>
+            <wp:effectExtent l="0" t="0" r="0" b="0"/>
+            <wp:wrapTight wrapText="bothSides">
+              <wp:wrapPolygon edited="0">
+                <wp:start x="0" y="0"/>
+                <wp:lineTo x="0" y="21393"/>
+                <wp:lineTo x="21488" y="21393"/>
+                <wp:lineTo x="21488" y="0"/>
+                <wp:lineTo x="0" y="0"/>
+              </wp:wrapPolygon>
+            </wp:wrapTight>
+            <wp:docPr id="15" name="Kép 15"/>
+            <wp:cNvGraphicFramePr>
+              <a:graphicFrameLocks xmlns:a="http://schemas.openxmlformats.org/drawingml/2006/main" noChangeAspect="1"/>
+            </wp:cNvGraphicFramePr>
+            <a:graphic xmlns:a="http://schemas.openxmlformats.org/drawingml/2006/main">
+              <a:graphicData uri="http://schemas.openxmlformats.org/drawingml/2006/picture">
+                <pic:pic xmlns:pic="http://schemas.openxmlformats.org/drawingml/2006/picture">
+                  <pic:nvPicPr>
+                    <pic:cNvPr id="0" name="Picture 7"/>
+                    <pic:cNvPicPr>
+                      <a:picLocks noChangeAspect="1" noChangeArrowheads="1"/>
+                    </pic:cNvPicPr>
+                  </pic:nvPicPr>
+                  <pic:blipFill>
+                    <a:blip r:embed="rId16" cstate="print">
+                      <a:extLst>
+                        <a:ext uri="{28A0092B-C50C-407E-A947-70E740481C1C}">
+                          <a14:useLocalDpi xmlns:a14="http://schemas.microsoft.com/office/drawing/2010/main" val="0"/>
+                        </a:ext>
+                      </a:extLst>
+                    </a:blip>
+                    <a:srcRect/>
+                    <a:stretch>
+                      <a:fillRect/>
+                    </a:stretch>
+                  </pic:blipFill>
+                  <pic:spPr bwMode="auto">
+                    <a:xfrm>
+                      <a:off x="0" y="0"/>
+                      <a:ext cx="3657600" cy="2058035"/>
+                    </a:xfrm>
+                    <a:prstGeom prst="rect">
+                      <a:avLst/>
+                    </a:prstGeom>
+                    <a:noFill/>
+                    <a:ln>
+                      <a:noFill/>
+                    </a:ln>
+                  </pic:spPr>
+                </pic:pic>
+              </a:graphicData>
+            </a:graphic>
+            <wp14:sizeRelH relativeFrom="page">
+              <wp14:pctWidth>0</wp14:pctWidth>
+            </wp14:sizeRelH>
+            <wp14:sizeRelV relativeFrom="page">
+              <wp14:pctHeight>0</wp14:pctHeight>
+            </wp14:sizeRelV>
+          </wp:anchor>
+        </w:drawing>
+      </w:r>
+      <w:r>
+        <w:rPr>
+          <w:rStyle w:val="Cmsor2Char"/>
+          <w:b/>
+        </w:rPr>
+        <w:t>Komment Kezelési Felület:</w:t>
+      </w:r>
+      <w:r>
+        <w:rPr>
+          <w:color w:val="000000" w:themeColor="text1"/>
+        </w:rPr>
+        <w:br/>
+        <w:t xml:space="preserve">Ezen a felületen a táblázatban láthatja az összes </w:t>
+      </w:r>
+      <w:r>
+        <w:rPr>
+          <w:color w:val="000000" w:themeColor="text1"/>
+        </w:rPr>
+        <w:t>kommentnek</w:t>
+      </w:r>
+      <w:r>
+        <w:rPr>
+          <w:color w:val="000000" w:themeColor="text1"/>
+        </w:rPr>
+        <w:t xml:space="preserve"> az adatait, a kép kivételével.</w:t>
+      </w:r>
+      <w:r>
+        <w:rPr>
+          <w:color w:val="000000" w:themeColor="text1"/>
+        </w:rPr>
+        <w:br/>
+        <w:t xml:space="preserve">A Keresés felirat alatti fehér mezőben, kezdje el írni a keresett </w:t>
+      </w:r>
+      <w:r>
+        <w:rPr>
+          <w:color w:val="000000" w:themeColor="text1"/>
+        </w:rPr>
+        <w:t>komment</w:t>
+      </w:r>
+      <w:r>
+        <w:rPr>
+          <w:color w:val="000000" w:themeColor="text1"/>
+        </w:rPr>
+        <w:t xml:space="preserve"> valamely adatát. Ez a táblázatból kiszűri a beírt adattal rendelkező</w:t>
+      </w:r>
+      <w:r>
+        <w:rPr>
+          <w:color w:val="000000" w:themeColor="text1"/>
+        </w:rPr>
+        <w:t xml:space="preserve"> kommentet</w:t>
+      </w:r>
+      <w:r>
+        <w:rPr>
+          <w:color w:val="000000" w:themeColor="text1"/>
+        </w:rPr>
+        <w:t>.</w:t>
+      </w:r>
+      <w:r>
+        <w:rPr>
+          <w:color w:val="000000" w:themeColor="text1"/>
+        </w:rPr>
+        <w:br/>
+        <w:t xml:space="preserve">A táblázatban kattintson egy sorra, ezzel kiválasztva az adott </w:t>
+      </w:r>
+      <w:r>
+        <w:rPr>
+          <w:color w:val="000000" w:themeColor="text1"/>
+        </w:rPr>
+        <w:t>kommentet</w:t>
+      </w:r>
+      <w:r>
+        <w:rPr>
+          <w:color w:val="000000" w:themeColor="text1"/>
+        </w:rPr>
+        <w:t>.</w:t>
+      </w:r>
+      <w:r>
+        <w:rPr>
+          <w:color w:val="000000" w:themeColor="text1"/>
+        </w:rPr>
+        <w:br/>
+        <w:t xml:space="preserve">A táblázat alatt elhelyezkedő </w:t>
+      </w:r>
+      <w:proofErr w:type="spellStart"/>
+      <w:r>
+        <w:rPr>
+          <w:color w:val="000000" w:themeColor="text1"/>
+        </w:rPr>
+        <w:t>invalidálás</w:t>
+      </w:r>
+      <w:proofErr w:type="spellEnd"/>
+      <w:r>
+        <w:rPr>
+          <w:color w:val="000000" w:themeColor="text1"/>
+        </w:rPr>
+        <w:t>/</w:t>
+      </w:r>
+      <w:proofErr w:type="spellStart"/>
+      <w:r>
+        <w:rPr>
+          <w:color w:val="000000" w:themeColor="text1"/>
+        </w:rPr>
+        <w:t>validálás</w:t>
+      </w:r>
+      <w:proofErr w:type="spellEnd"/>
+      <w:r>
+        <w:rPr>
+          <w:color w:val="000000" w:themeColor="text1"/>
+        </w:rPr>
+        <w:t xml:space="preserve"> gombokkal állíthatja a </w:t>
+      </w:r>
+      <w:r>
+        <w:rPr>
+          <w:color w:val="000000" w:themeColor="text1"/>
+        </w:rPr>
+        <w:t>komment</w:t>
+      </w:r>
+      <w:r>
+        <w:rPr>
+          <w:color w:val="000000" w:themeColor="text1"/>
+        </w:rPr>
+        <w:t xml:space="preserve"> érvényességét.</w:t>
+      </w:r>
+      <w:r>
+        <w:rPr>
+          <w:color w:val="000000" w:themeColor="text1"/>
+        </w:rPr>
+        <w:br/>
+      </w:r>
+      <w:proofErr w:type="spellStart"/>
+      <w:r>
+        <w:rPr>
+          <w:color w:val="000000" w:themeColor="text1"/>
+        </w:rPr>
+        <w:t>Invalidálás</w:t>
+      </w:r>
+      <w:proofErr w:type="spellEnd"/>
+      <w:r>
+        <w:rPr>
+          <w:color w:val="000000" w:themeColor="text1"/>
+        </w:rPr>
+        <w:t xml:space="preserve"> =&gt; </w:t>
+      </w:r>
+      <w:proofErr w:type="spellStart"/>
+      <w:r>
+        <w:rPr>
+          <w:color w:val="000000" w:themeColor="text1"/>
+        </w:rPr>
+        <w:t>valid</w:t>
+      </w:r>
+      <w:proofErr w:type="spellEnd"/>
+      <w:r>
+        <w:rPr>
+          <w:color w:val="000000" w:themeColor="text1"/>
+        </w:rPr>
+        <w:t xml:space="preserve"> = 0 (érvénytelen) =&gt; Nem férnek hozzá a felhasználók.</w:t>
+      </w:r>
+      <w:r>
+        <w:rPr>
+          <w:color w:val="000000" w:themeColor="text1"/>
+        </w:rPr>
+        <w:br/>
+      </w:r>
+      <w:proofErr w:type="spellStart"/>
+      <w:r>
+        <w:rPr>
+          <w:color w:val="000000" w:themeColor="text1"/>
+        </w:rPr>
+        <w:t>Validálás</w:t>
+      </w:r>
+      <w:proofErr w:type="spellEnd"/>
+      <w:r>
+        <w:rPr>
+          <w:color w:val="000000" w:themeColor="text1"/>
+        </w:rPr>
+        <w:t xml:space="preserve"> =&gt; </w:t>
+      </w:r>
+      <w:proofErr w:type="spellStart"/>
+      <w:r>
+        <w:rPr>
+          <w:color w:val="000000" w:themeColor="text1"/>
+        </w:rPr>
+        <w:t>valid</w:t>
+      </w:r>
+      <w:proofErr w:type="spellEnd"/>
+      <w:r>
+        <w:rPr>
+          <w:color w:val="000000" w:themeColor="text1"/>
+        </w:rPr>
+        <w:t xml:space="preserve"> = 1 (érvényes) =&gt; Hozzáférnek a felhasználók.</w:t>
+      </w:r>
+      <w:r>
+        <w:rPr>
+          <w:color w:val="000000" w:themeColor="text1"/>
+        </w:rPr>
+        <w:br/>
+        <w:t>Vissza gombra kattintáskor, bezáródik az oldal, a kezdőoldalra tér vissza.</w:t>
+      </w:r>
+    </w:p>
+    <w:p>
+      <w:pPr>
+        <w:shd w:val="clear" w:color="auto" w:fill="FFFFFF" w:themeFill="background1"/>
+        <w:rPr>
+          <w:color w:val="000000" w:themeColor="text1"/>
+        </w:rPr>
+      </w:pPr>
+      <w:r>
+        <w:rPr>
+          <w:noProof/>
+          <w:color w:val="000000" w:themeColor="text1"/>
+        </w:rPr>
+        <w:lastRenderedPageBreak/>
+        <w:drawing>
+          <wp:anchor distT="0" distB="0" distL="114300" distR="114300" simplePos="0" relativeHeight="251671552" behindDoc="1" locked="0" layoutInCell="1" allowOverlap="1">
+            <wp:simplePos x="0" y="0"/>
+            <wp:positionH relativeFrom="margin">
+              <wp:align>right</wp:align>
+            </wp:positionH>
+            <wp:positionV relativeFrom="paragraph">
+              <wp:posOffset>2439394</wp:posOffset>
+            </wp:positionV>
+            <wp:extent cx="5731510" cy="3225800"/>
+            <wp:effectExtent l="0" t="0" r="2540" b="0"/>
+            <wp:wrapTight wrapText="bothSides">
+              <wp:wrapPolygon edited="0">
+                <wp:start x="0" y="0"/>
+                <wp:lineTo x="0" y="21430"/>
+                <wp:lineTo x="21538" y="21430"/>
+                <wp:lineTo x="21538" y="0"/>
+                <wp:lineTo x="0" y="0"/>
+              </wp:wrapPolygon>
+            </wp:wrapTight>
+            <wp:docPr id="17" name="Kép 17"/>
+            <wp:cNvGraphicFramePr>
+              <a:graphicFrameLocks xmlns:a="http://schemas.openxmlformats.org/drawingml/2006/main" noChangeAspect="1"/>
+            </wp:cNvGraphicFramePr>
+            <a:graphic xmlns:a="http://schemas.openxmlformats.org/drawingml/2006/main">
+              <a:graphicData uri="http://schemas.openxmlformats.org/drawingml/2006/picture">
+                <pic:pic xmlns:pic="http://schemas.openxmlformats.org/drawingml/2006/picture">
+                  <pic:nvPicPr>
+                    <pic:cNvPr id="0" name="Picture 9"/>
+                    <pic:cNvPicPr>
+                      <a:picLocks noChangeAspect="1" noChangeArrowheads="1"/>
+                    </pic:cNvPicPr>
+                  </pic:nvPicPr>
+                  <pic:blipFill>
+                    <a:blip r:embed="rId17" cstate="print">
+                      <a:extLst>
+                        <a:ext uri="{28A0092B-C50C-407E-A947-70E740481C1C}">
+                          <a14:useLocalDpi xmlns:a14="http://schemas.microsoft.com/office/drawing/2010/main" val="0"/>
+                        </a:ext>
+                      </a:extLst>
+                    </a:blip>
+                    <a:srcRect/>
+                    <a:stretch>
+                      <a:fillRect/>
+                    </a:stretch>
+                  </pic:blipFill>
+                  <pic:spPr bwMode="auto">
+                    <a:xfrm>
+                      <a:off x="0" y="0"/>
+                      <a:ext cx="5731510" cy="3225800"/>
+                    </a:xfrm>
+                    <a:prstGeom prst="rect">
+                      <a:avLst/>
+                    </a:prstGeom>
+                    <a:noFill/>
+                    <a:ln>
+                      <a:noFill/>
+                    </a:ln>
+                  </pic:spPr>
+                </pic:pic>
+              </a:graphicData>
+            </a:graphic>
+            <wp14:sizeRelH relativeFrom="page">
+              <wp14:pctWidth>0</wp14:pctWidth>
+            </wp14:sizeRelH>
+            <wp14:sizeRelV relativeFrom="page">
+              <wp14:pctHeight>0</wp14:pctHeight>
+            </wp14:sizeRelV>
+          </wp:anchor>
+        </w:drawing>
+      </w:r>
+    </w:p>
+    <w:p>
+      <w:pPr>
+        <w:shd w:val="clear" w:color="auto" w:fill="FFFFFF" w:themeFill="background1"/>
+        <w:rPr>
+          <w:color w:val="000000" w:themeColor="text1"/>
+        </w:rPr>
+      </w:pPr>
+      <w:r>
+        <w:rPr>
+          <w:color w:val="000000" w:themeColor="text1"/>
+        </w:rPr>
+        <w:br/>
+      </w:r>
+      <w:r>
+        <w:rPr>
+          <w:color w:val="000000" w:themeColor="text1"/>
+        </w:rPr>
+        <w:br/>
+      </w:r>
+      <w:r>
+        <w:rPr>
+          <w:color w:val="000000" w:themeColor="text1"/>
+        </w:rPr>
+        <w:br/>
+      </w:r>
+      <w:r>
+        <w:rPr>
+          <w:color w:val="000000" w:themeColor="text1"/>
+        </w:rPr>
+        <w:br/>
+      </w:r>
+      <w:r>
+        <w:rPr>
+          <w:color w:val="000000" w:themeColor="text1"/>
+        </w:rPr>
+        <w:br/>
+      </w:r>
+      <w:r>
+        <w:rPr>
+          <w:color w:val="000000" w:themeColor="text1"/>
+        </w:rPr>
+        <w:br/>
+      </w:r>
+      <w:r>
+        <w:rPr>
+          <w:color w:val="000000" w:themeColor="text1"/>
+        </w:rPr>
+        <w:br/>
+      </w:r>
+      <w:r>
+        <w:rPr>
+          <w:rStyle w:val="Cmsor2Char"/>
+          <w:b/>
+        </w:rPr>
+        <w:t>Bejelentés Kezelési Felület:</w:t>
+      </w:r>
+      <w:r>
+        <w:rPr>
+          <w:color w:val="000000" w:themeColor="text1"/>
+        </w:rPr>
+        <w:br/>
+        <w:t xml:space="preserve">Ezen a felületen a táblázatban láthatja az összes </w:t>
+      </w:r>
+      <w:r>
+        <w:rPr>
+          <w:color w:val="000000" w:themeColor="text1"/>
+        </w:rPr>
+        <w:t>b</w:t>
+      </w:r>
+      <w:r>
+        <w:rPr>
+          <w:color w:val="000000" w:themeColor="text1"/>
+        </w:rPr>
+        <w:t>ejelentés</w:t>
+      </w:r>
+      <w:r>
+        <w:rPr>
+          <w:color w:val="000000" w:themeColor="text1"/>
+        </w:rPr>
+        <w:t>nek</w:t>
+      </w:r>
+      <w:r>
+        <w:rPr>
+          <w:color w:val="000000" w:themeColor="text1"/>
+        </w:rPr>
+        <w:t xml:space="preserve"> az adatait, a kép kivételével.</w:t>
+      </w:r>
+      <w:r>
+        <w:rPr>
+          <w:color w:val="000000" w:themeColor="text1"/>
+        </w:rPr>
+        <w:br/>
+        <w:t>A Keresés felirat alatti fehér mezőben, kezdje el írni a keresett</w:t>
+      </w:r>
+      <w:r>
+        <w:rPr>
+          <w:color w:val="000000" w:themeColor="text1"/>
+        </w:rPr>
+        <w:t xml:space="preserve"> </w:t>
+      </w:r>
+      <w:r>
+        <w:rPr>
+          <w:color w:val="000000" w:themeColor="text1"/>
+        </w:rPr>
+        <w:t>bejelentés</w:t>
+      </w:r>
+      <w:r>
+        <w:rPr>
+          <w:color w:val="000000" w:themeColor="text1"/>
+        </w:rPr>
+        <w:t xml:space="preserve"> </w:t>
+      </w:r>
+      <w:r>
+        <w:rPr>
+          <w:color w:val="000000" w:themeColor="text1"/>
+        </w:rPr>
+        <w:t xml:space="preserve">valamely adatát. Ez a táblázatból kiszűri a beírt adattal rendelkező </w:t>
+      </w:r>
+      <w:r>
+        <w:rPr>
+          <w:color w:val="000000" w:themeColor="text1"/>
+        </w:rPr>
+        <w:t>bejelentés</w:t>
+      </w:r>
+      <w:r>
+        <w:rPr>
+          <w:color w:val="000000" w:themeColor="text1"/>
+        </w:rPr>
+        <w:t>eket</w:t>
+      </w:r>
+      <w:r>
+        <w:rPr>
+          <w:color w:val="000000" w:themeColor="text1"/>
+        </w:rPr>
+        <w:t>.</w:t>
+      </w:r>
+      <w:r>
+        <w:rPr>
+          <w:color w:val="000000" w:themeColor="text1"/>
+        </w:rPr>
+        <w:br/>
+        <w:t xml:space="preserve">A táblázatban kattintson egy sorra, ezzel kiválasztva az adott </w:t>
+      </w:r>
+      <w:r>
+        <w:rPr>
+          <w:color w:val="000000" w:themeColor="text1"/>
+        </w:rPr>
+        <w:t>bejelentés</w:t>
+      </w:r>
+      <w:r>
+        <w:rPr>
+          <w:color w:val="000000" w:themeColor="text1"/>
+        </w:rPr>
+        <w:t>eket</w:t>
+      </w:r>
+      <w:r>
+        <w:rPr>
+          <w:color w:val="000000" w:themeColor="text1"/>
+        </w:rPr>
+        <w:t>.</w:t>
+      </w:r>
+      <w:r>
+        <w:rPr>
+          <w:color w:val="000000" w:themeColor="text1"/>
+        </w:rPr>
+        <w:br/>
+        <w:t xml:space="preserve">A táblázat alatt elhelyezkedő </w:t>
+      </w:r>
+      <w:r>
+        <w:rPr>
+          <w:color w:val="000000" w:themeColor="text1"/>
+        </w:rPr>
+        <w:t>kitiltás</w:t>
+      </w:r>
+      <w:r>
+        <w:rPr>
+          <w:color w:val="000000" w:themeColor="text1"/>
+        </w:rPr>
+        <w:t xml:space="preserve"> gomb</w:t>
+      </w:r>
+      <w:r>
+        <w:rPr>
+          <w:color w:val="000000" w:themeColor="text1"/>
+        </w:rPr>
+        <w:t>bal kitilthatja bejelentett felhasználót</w:t>
+      </w:r>
+      <w:r>
+        <w:rPr>
+          <w:color w:val="000000" w:themeColor="text1"/>
+        </w:rPr>
+        <w:t>.</w:t>
+      </w:r>
+      <w:r>
+        <w:rPr>
+          <w:color w:val="000000" w:themeColor="text1"/>
+        </w:rPr>
+        <w:br/>
+      </w:r>
+      <w:r>
+        <w:rPr>
+          <w:color w:val="000000" w:themeColor="text1"/>
+        </w:rPr>
+        <w:t>Kitiltás</w:t>
+      </w:r>
+      <w:r>
+        <w:rPr>
+          <w:color w:val="000000" w:themeColor="text1"/>
+        </w:rPr>
+        <w:t xml:space="preserve"> =&gt; </w:t>
+      </w:r>
+      <w:proofErr w:type="spellStart"/>
+      <w:r>
+        <w:rPr>
+          <w:color w:val="000000" w:themeColor="text1"/>
+        </w:rPr>
+        <w:t>Blocked</w:t>
+      </w:r>
+      <w:proofErr w:type="spellEnd"/>
+      <w:r>
+        <w:rPr>
+          <w:color w:val="000000" w:themeColor="text1"/>
+        </w:rPr>
+        <w:t xml:space="preserve"> = </w:t>
+      </w:r>
+      <w:r>
+        <w:rPr>
+          <w:color w:val="000000" w:themeColor="text1"/>
+        </w:rPr>
+        <w:t>1</w:t>
+      </w:r>
+      <w:r>
+        <w:rPr>
+          <w:color w:val="000000" w:themeColor="text1"/>
+        </w:rPr>
+        <w:t xml:space="preserve"> (</w:t>
+      </w:r>
+      <w:r>
+        <w:rPr>
+          <w:color w:val="000000" w:themeColor="text1"/>
+        </w:rPr>
+        <w:t>kitiltva</w:t>
+      </w:r>
+      <w:r>
+        <w:rPr>
+          <w:color w:val="000000" w:themeColor="text1"/>
+        </w:rPr>
+        <w:t>)</w:t>
+      </w:r>
+      <w:r>
+        <w:rPr>
+          <w:color w:val="000000" w:themeColor="text1"/>
+        </w:rPr>
+        <w:br/>
+      </w:r>
+      <w:r>
+        <w:rPr>
+          <w:color w:val="000000" w:themeColor="text1"/>
+        </w:rPr>
+        <w:t>Ilyenkor a bejelentés is automatikusan törlődik!</w:t>
+      </w:r>
+      <w:r>
+        <w:rPr>
+          <w:color w:val="000000" w:themeColor="text1"/>
+        </w:rPr>
+        <w:br/>
+        <w:t>A törlés gombra kattintva a bejelentés törlődik, a bejelentett felhasználó kitiltása nélkül.</w:t>
+      </w:r>
+      <w:r>
+        <w:rPr>
+          <w:color w:val="000000" w:themeColor="text1"/>
+        </w:rPr>
+        <w:br/>
+        <w:t>Vissza gombra kattintáskor, bezáródik az oldal, a kezdőoldalra tér vissza</w:t>
+      </w:r>
+      <w:r>
+        <w:rPr>
+          <w:color w:val="000000" w:themeColor="text1"/>
+        </w:rPr>
+        <w:t>.</w:t>
+      </w:r>
+      <w:r>
+        <w:rPr>
+          <w:color w:val="000000" w:themeColor="text1"/>
+        </w:rPr>
+        <w:br/>
+      </w:r>
+      <w:bookmarkStart w:id="0" w:name="_GoBack"/>
+      <w:bookmarkEnd w:id="0"/>
+      <w:r>
+        <w:rPr>
+          <w:color w:val="000000" w:themeColor="text1"/>
+        </w:rPr>
+        <w:br/>
+      </w:r>
+      <w:r>
+        <w:rPr>
+          <w:noProof/>
+          <w:color w:val="000000" w:themeColor="text1"/>
+        </w:rPr>
+        <w:drawing>
+          <wp:anchor distT="0" distB="0" distL="114300" distR="114300" simplePos="0" relativeHeight="251672576" behindDoc="1" locked="0" layoutInCell="1" allowOverlap="1">
+            <wp:simplePos x="0" y="0"/>
+            <wp:positionH relativeFrom="page">
+              <wp:posOffset>103517</wp:posOffset>
+            </wp:positionH>
+            <wp:positionV relativeFrom="paragraph">
+              <wp:posOffset>2730392</wp:posOffset>
+            </wp:positionV>
+            <wp:extent cx="3571875" cy="2009775"/>
+            <wp:effectExtent l="0" t="0" r="9525" b="9525"/>
+            <wp:wrapTight wrapText="bothSides">
+              <wp:wrapPolygon edited="0">
+                <wp:start x="0" y="0"/>
+                <wp:lineTo x="0" y="21498"/>
+                <wp:lineTo x="21542" y="21498"/>
+                <wp:lineTo x="21542" y="0"/>
+                <wp:lineTo x="0" y="0"/>
+              </wp:wrapPolygon>
+            </wp:wrapTight>
+            <wp:docPr id="18" name="Kép 18"/>
+            <wp:cNvGraphicFramePr>
+              <a:graphicFrameLocks xmlns:a="http://schemas.openxmlformats.org/drawingml/2006/main" noChangeAspect="1"/>
+            </wp:cNvGraphicFramePr>
+            <a:graphic xmlns:a="http://schemas.openxmlformats.org/drawingml/2006/main">
+              <a:graphicData uri="http://schemas.openxmlformats.org/drawingml/2006/picture">
+                <pic:pic xmlns:pic="http://schemas.openxmlformats.org/drawingml/2006/picture">
+                  <pic:nvPicPr>
+                    <pic:cNvPr id="0" name="Picture 10"/>
+                    <pic:cNvPicPr>
+                      <a:picLocks noChangeAspect="1" noChangeArrowheads="1"/>
+                    </pic:cNvPicPr>
+                  </pic:nvPicPr>
+                  <pic:blipFill>
+                    <a:blip r:embed="rId18" cstate="print">
+                      <a:extLst>
+                        <a:ext uri="{28A0092B-C50C-407E-A947-70E740481C1C}">
+                          <a14:useLocalDpi xmlns:a14="http://schemas.microsoft.com/office/drawing/2010/main" val="0"/>
+                        </a:ext>
+                      </a:extLst>
+                    </a:blip>
+                    <a:srcRect/>
+                    <a:stretch>
+                      <a:fillRect/>
+                    </a:stretch>
+                  </pic:blipFill>
+                  <pic:spPr bwMode="auto">
+                    <a:xfrm>
+                      <a:off x="0" y="0"/>
+                      <a:ext cx="3571875" cy="2009775"/>
+                    </a:xfrm>
+                    <a:prstGeom prst="rect">
+                      <a:avLst/>
+                    </a:prstGeom>
+                    <a:noFill/>
+                    <a:ln>
+                      <a:noFill/>
+                    </a:ln>
+                  </pic:spPr>
+                </pic:pic>
+              </a:graphicData>
+            </a:graphic>
+            <wp14:sizeRelH relativeFrom="page">
+              <wp14:pctWidth>0</wp14:pctWidth>
+            </wp14:sizeRelH>
+            <wp14:sizeRelV relativeFrom="page">
+              <wp14:pctHeight>0</wp14:pctHeight>
+            </wp14:sizeRelV>
+          </wp:anchor>
+        </w:drawing>
+      </w:r>
+      <w:r>
+        <w:rPr>
+          <w:noProof/>
+          <w:color w:val="000000" w:themeColor="text1"/>
+        </w:rPr>
+        <w:drawing>
+          <wp:anchor distT="0" distB="0" distL="114300" distR="114300" simplePos="0" relativeHeight="251673600" behindDoc="1" locked="0" layoutInCell="1" allowOverlap="1">
+            <wp:simplePos x="0" y="0"/>
+            <wp:positionH relativeFrom="column">
+              <wp:posOffset>2929063</wp:posOffset>
+            </wp:positionH>
+            <wp:positionV relativeFrom="paragraph">
+              <wp:posOffset>2725551</wp:posOffset>
+            </wp:positionV>
+            <wp:extent cx="3668395" cy="2064385"/>
+            <wp:effectExtent l="0" t="0" r="8255" b="0"/>
+            <wp:wrapTight wrapText="bothSides">
+              <wp:wrapPolygon edited="0">
+                <wp:start x="0" y="0"/>
+                <wp:lineTo x="0" y="21328"/>
+                <wp:lineTo x="21536" y="21328"/>
+                <wp:lineTo x="21536" y="0"/>
+                <wp:lineTo x="0" y="0"/>
+              </wp:wrapPolygon>
+            </wp:wrapTight>
+            <wp:docPr id="19" name="Kép 19"/>
+            <wp:cNvGraphicFramePr>
+              <a:graphicFrameLocks xmlns:a="http://schemas.openxmlformats.org/drawingml/2006/main" noChangeAspect="1"/>
+            </wp:cNvGraphicFramePr>
+            <a:graphic xmlns:a="http://schemas.openxmlformats.org/drawingml/2006/main">
+              <a:graphicData uri="http://schemas.openxmlformats.org/drawingml/2006/picture">
+                <pic:pic xmlns:pic="http://schemas.openxmlformats.org/drawingml/2006/picture">
+                  <pic:nvPicPr>
+                    <pic:cNvPr id="0" name="Picture 11"/>
+                    <pic:cNvPicPr>
+                      <a:picLocks noChangeAspect="1" noChangeArrowheads="1"/>
+                    </pic:cNvPicPr>
+                  </pic:nvPicPr>
+                  <pic:blipFill>
+                    <a:blip r:embed="rId19" cstate="print">
+                      <a:extLst>
+                        <a:ext uri="{28A0092B-C50C-407E-A947-70E740481C1C}">
+                          <a14:useLocalDpi xmlns:a14="http://schemas.microsoft.com/office/drawing/2010/main" val="0"/>
+                        </a:ext>
+                      </a:extLst>
+                    </a:blip>
+                    <a:srcRect/>
+                    <a:stretch>
+                      <a:fillRect/>
+                    </a:stretch>
+                  </pic:blipFill>
+                  <pic:spPr bwMode="auto">
+                    <a:xfrm>
+                      <a:off x="0" y="0"/>
+                      <a:ext cx="3668395" cy="2064385"/>
+                    </a:xfrm>
+                    <a:prstGeom prst="rect">
+                      <a:avLst/>
+                    </a:prstGeom>
+                    <a:noFill/>
+                    <a:ln>
+                      <a:noFill/>
+                    </a:ln>
+                  </pic:spPr>
+                </pic:pic>
+              </a:graphicData>
+            </a:graphic>
+            <wp14:sizeRelH relativeFrom="page">
+              <wp14:pctWidth>0</wp14:pctWidth>
+            </wp14:sizeRelH>
+            <wp14:sizeRelV relativeFrom="page">
+              <wp14:pctHeight>0</wp14:pctHeight>
+            </wp14:sizeRelV>
+          </wp:anchor>
+        </w:drawing>
       </w:r>
     </w:p>
     <w:sectPr>
@@ -1083,6 +3259,49 @@
     <w:name w:val="Normal"/>
     <w:qFormat/>
   </w:style>
+  <w:style w:type="paragraph" w:styleId="Cmsor1">
+    <w:name w:val="heading 1"/>
+    <w:basedOn w:val="Norml"/>
+    <w:next w:val="Norml"/>
+    <w:link w:val="Cmsor1Char"/>
+    <w:uiPriority w:val="9"/>
+    <w:qFormat/>
+    <w:rsid w:val="00F51750"/>
+    <w:pPr>
+      <w:keepNext/>
+      <w:keepLines/>
+      <w:spacing w:before="240" w:after="0"/>
+      <w:outlineLvl w:val="0"/>
+    </w:pPr>
+    <w:rPr>
+      <w:rFonts w:asciiTheme="majorHAnsi" w:eastAsiaTheme="majorEastAsia" w:hAnsiTheme="majorHAnsi" w:cstheme="majorBidi"/>
+      <w:color w:val="2F5496" w:themeColor="accent1" w:themeShade="BF"/>
+      <w:sz w:val="32"/>
+      <w:szCs w:val="32"/>
+    </w:rPr>
+  </w:style>
+  <w:style w:type="paragraph" w:styleId="Cmsor2">
+    <w:name w:val="heading 2"/>
+    <w:basedOn w:val="Norml"/>
+    <w:next w:val="Norml"/>
+    <w:link w:val="Cmsor2Char"/>
+    <w:uiPriority w:val="9"/>
+    <w:unhideWhenUsed/>
+    <w:qFormat/>
+    <w:rsid w:val="00F51750"/>
+    <w:pPr>
+      <w:keepNext/>
+      <w:keepLines/>
+      <w:spacing w:before="40" w:after="0"/>
+      <w:outlineLvl w:val="1"/>
+    </w:pPr>
+    <w:rPr>
+      <w:rFonts w:asciiTheme="majorHAnsi" w:eastAsiaTheme="majorEastAsia" w:hAnsiTheme="majorHAnsi" w:cstheme="majorBidi"/>
+      <w:color w:val="2F5496" w:themeColor="accent1" w:themeShade="BF"/>
+      <w:sz w:val="26"/>
+      <w:szCs w:val="26"/>
+    </w:rPr>
+  </w:style>
   <w:style w:type="character" w:default="1" w:styleId="Bekezdsalapbettpusa">
     <w:name w:val="Default Paragraph Font"/>
     <w:uiPriority w:val="1"/>
@@ -1109,6 +3328,79 @@
     <w:uiPriority w:val="99"/>
     <w:semiHidden/>
     <w:unhideWhenUsed/>
+  </w:style>
+  <w:style w:type="paragraph" w:styleId="Kiemeltidzet">
+    <w:name w:val="Intense Quote"/>
+    <w:basedOn w:val="Norml"/>
+    <w:next w:val="Norml"/>
+    <w:link w:val="KiemeltidzetChar"/>
+    <w:uiPriority w:val="30"/>
+    <w:qFormat/>
+    <w:rsid w:val="00F51750"/>
+    <w:pPr>
+      <w:pBdr>
+        <w:top w:val="single" w:sz="4" w:space="10" w:color="4472C4" w:themeColor="accent1"/>
+        <w:bottom w:val="single" w:sz="4" w:space="10" w:color="4472C4" w:themeColor="accent1"/>
+      </w:pBdr>
+      <w:spacing w:before="360" w:after="360"/>
+      <w:ind w:left="864" w:right="864"/>
+      <w:jc w:val="center"/>
+    </w:pPr>
+    <w:rPr>
+      <w:i/>
+      <w:iCs/>
+      <w:color w:val="4472C4" w:themeColor="accent1"/>
+    </w:rPr>
+  </w:style>
+  <w:style w:type="character" w:customStyle="1" w:styleId="KiemeltidzetChar">
+    <w:name w:val="Kiemelt idézet Char"/>
+    <w:basedOn w:val="Bekezdsalapbettpusa"/>
+    <w:link w:val="Kiemeltidzet"/>
+    <w:uiPriority w:val="30"/>
+    <w:rsid w:val="00F51750"/>
+    <w:rPr>
+      <w:i/>
+      <w:iCs/>
+      <w:color w:val="4472C4" w:themeColor="accent1"/>
+    </w:rPr>
+  </w:style>
+  <w:style w:type="character" w:styleId="Erskiemels">
+    <w:name w:val="Intense Emphasis"/>
+    <w:basedOn w:val="Bekezdsalapbettpusa"/>
+    <w:uiPriority w:val="21"/>
+    <w:qFormat/>
+    <w:rsid w:val="00F51750"/>
+    <w:rPr>
+      <w:i/>
+      <w:iCs/>
+      <w:color w:val="4472C4" w:themeColor="accent1"/>
+    </w:rPr>
+  </w:style>
+  <w:style w:type="character" w:customStyle="1" w:styleId="Cmsor2Char">
+    <w:name w:val="Címsor 2 Char"/>
+    <w:basedOn w:val="Bekezdsalapbettpusa"/>
+    <w:link w:val="Cmsor2"/>
+    <w:uiPriority w:val="9"/>
+    <w:rsid w:val="00F51750"/>
+    <w:rPr>
+      <w:rFonts w:asciiTheme="majorHAnsi" w:eastAsiaTheme="majorEastAsia" w:hAnsiTheme="majorHAnsi" w:cstheme="majorBidi"/>
+      <w:color w:val="2F5496" w:themeColor="accent1" w:themeShade="BF"/>
+      <w:sz w:val="26"/>
+      <w:szCs w:val="26"/>
+    </w:rPr>
+  </w:style>
+  <w:style w:type="character" w:customStyle="1" w:styleId="Cmsor1Char">
+    <w:name w:val="Címsor 1 Char"/>
+    <w:basedOn w:val="Bekezdsalapbettpusa"/>
+    <w:link w:val="Cmsor1"/>
+    <w:uiPriority w:val="9"/>
+    <w:rsid w:val="00F51750"/>
+    <w:rPr>
+      <w:rFonts w:asciiTheme="majorHAnsi" w:eastAsiaTheme="majorEastAsia" w:hAnsiTheme="majorHAnsi" w:cstheme="majorBidi"/>
+      <w:color w:val="2F5496" w:themeColor="accent1" w:themeShade="BF"/>
+      <w:sz w:val="32"/>
+      <w:szCs w:val="32"/>
+    </w:rPr>
   </w:style>
 </w:styles>
 </file>

</xml_diff>